<commit_message>
refactor(ui,docs): toi uu giao dien toi gian Material 3 va chuan hoa bao cao Word hoc thuat
</commit_message>
<xml_diff>
--- a/BAO_CAO_TH1_KIEN_TRUC_CASHEW.docx
+++ b/BAO_CAO_TH1_KIEN_TRUC_CASHEW.docx
@@ -4,63 +4,111 @@
   <w:body>
     <w:p>
       <w:pPr>
-        <w:spacing w:after="360"/>
+        <w:spacing w:after="400"/>
         <w:jc w:val="center"/>
       </w:pPr>
       <w:r>
         <w:rPr>
           <w:b/>
-          <w:color w:val="475569"/>
-          <w:sz w:val="24"/>
+          <w:color w:val="4B5563"/>
+          <w:sz w:val="22"/>
         </w:rPr>
         <w:t>BÀI TẬP THỰC HÀNH PHÁT TRIỂN ỨNG DỤNG DI ĐỘNG (TH1)</w:t>
+        <w:br/>
       </w:r>
     </w:p>
     <w:p>
       <w:pPr>
-        <w:spacing w:after="240"/>
+        <w:spacing w:after="160"/>
         <w:jc w:val="center"/>
       </w:pPr>
       <w:r>
         <w:rPr>
           <w:b/>
-          <w:color w:val="1E3A8A"/>
-          <w:sz w:val="38"/>
+          <w:color w:val="0F172A"/>
+          <w:sz w:val="32"/>
         </w:rPr>
-        <w:t>BÁO CÁO GIẢI TRÌNH THỰC HIỆN CHECKLIST</w:t>
+        <w:t>BÁO CÁO KỸ THUẬT VÀ GIẢI TRÌNH KIẾN TRÚC</w:t>
         <w:br/>
-        <w:t>ỨNG DỤNG QUẢN LÝ TÀI LIỆU HỌC TẬP</w:t>
-        <w:br/>
-        <w:t>THEO KIẾN TRÚC CASHEW</w:t>
+        <w:t>ỨNG DỤNG QUẢN LÝ TÀI LIỆU HỌC TẬP THEO KIẾN TRÚC CASHEW</w:t>
       </w:r>
     </w:p>
     <w:p>
       <w:pPr>
-        <w:spacing w:after="480"/>
+        <w:spacing w:after="400"/>
         <w:jc w:val="center"/>
       </w:pPr>
       <w:r>
         <w:rPr>
           <w:i/>
           <w:color w:val="64748B"/>
-          <w:sz w:val="20"/>
+          <w:sz w:val="19"/>
         </w:rPr>
-        <w:t>Framework: Flutter 3.x / Dart 3.x  •  Database: SQLite Reactive  •  Design: Material Design 3</w:t>
+        <w:t>Công nghệ: Flutter 3.x / Dart 3.x  •  Cơ sở dữ liệu: SQLite Reactive  •  Thiết kế: Material Design 3</w:t>
         <w:br/>
-        <w:t>Repository tham chiếu: https://github.com/jameskokoska/Cashew</w:t>
+        <w:t>Mã nguồn tham chiếu: https://github.com/jameskokoska/Cashew</w:t>
       </w:r>
     </w:p>
     <w:p>
       <w:pPr>
-        <w:spacing w:after="160"/>
+        <w:spacing w:after="320"/>
       </w:pPr>
       <w:r>
         <w:rPr>
           <w:b/>
-          <w:color w:val="1E3A8A"/>
-          <w:sz w:val="26"/>
         </w:rPr>
-        <w:t>TỔNG HỢP KẾT QUẢ ĐẠT ĐƯỢC THEO 5 MỤC CHECKLIST</w:t>
+        <w:t xml:space="preserve">Học viên / Sinh viên thực hiện: </w:t>
+      </w:r>
+      <w:r>
+        <w:t xml:space="preserve">....................................................      </w:t>
+      </w:r>
+      <w:r>
+        <w:rPr>
+          <w:b/>
+        </w:rPr>
+        <w:t xml:space="preserve">Mã số sinh viên: </w:t>
+      </w:r>
+      <w:r>
+        <w:t>..........................</w:t>
+        <w:br/>
+      </w:r>
+      <w:r>
+        <w:rPr>
+          <w:b/>
+        </w:rPr>
+        <w:t xml:space="preserve">Lớp học phần: </w:t>
+      </w:r>
+      <w:r>
+        <w:t xml:space="preserve">......................................................................      </w:t>
+      </w:r>
+      <w:r>
+        <w:rPr>
+          <w:b/>
+        </w:rPr>
+        <w:t xml:space="preserve">Giảng viên hướng dẫn: </w:t>
+      </w:r>
+      <w:r>
+        <w:t>..........................</w:t>
+      </w:r>
+    </w:p>
+    <w:p>
+      <w:pPr>
+        <w:keepNext/>
+        <w:spacing w:before="320" w:after="120"/>
+      </w:pPr>
+      <w:r>
+        <w:rPr>
+          <w:rFonts w:ascii="Calibri" w:hAnsi="Calibri"/>
+          <w:b/>
+          <w:color w:val="0F172A"/>
+          <w:sz w:val="27"/>
+        </w:rPr>
+        <w:t>TỔNG HỢP TIẾN ĐỘ THỰC HIỆN THEO 5 MỤC CHECKLIST</w:t>
+      </w:r>
+    </w:p>
+    <w:p>
+      <w:r>
+        <w:t>Dưới đây là bảng tổng hợp kết quả đối chiếu giữa 5 yêu cầu trong đề bài thực hành và việc triển khai thực tế trong mã nguồn dự án:</w:t>
       </w:r>
     </w:p>
     <w:tbl>
@@ -69,83 +117,112 @@
         <w:jc w:val="center"/>
         <w:tblLook w:firstColumn="1" w:firstRow="1" w:lastColumn="0" w:lastRow="0" w:noHBand="0" w:noVBand="1" w:val="04A0"/>
         <w:tblBorders>
-          <w:top w:val="single" w:sz="4" w:space="0" w:color="CBD5E1"/>
-          <w:bottom w:val="single" w:sz="4" w:space="0" w:color="CBD5E1"/>
+          <w:top w:val="single" w:sz="4" w:space="0" w:color="D1D5DB"/>
+          <w:bottom w:val="single" w:sz="4" w:space="0" w:color="D1D5DB"/>
           <w:left w:val="none"/>
           <w:right w:val="none"/>
-          <w:insideH w:val="single" w:sz="4" w:space="0" w:color="CBD5E1"/>
+          <w:insideH w:val="single" w:sz="4" w:space="0" w:color="D1D5DB"/>
           <w:insideV w:val="none"/>
         </w:tblBorders>
       </w:tblPr>
       <w:tblGrid>
-        <w:gridCol w:w="3216"/>
-        <w:gridCol w:w="3216"/>
-        <w:gridCol w:w="3216"/>
+        <w:gridCol w:w="2340"/>
+        <w:gridCol w:w="2340"/>
+        <w:gridCol w:w="2340"/>
+        <w:gridCol w:w="2340"/>
       </w:tblGrid>
       <w:tr>
         <w:tc>
           <w:tcPr>
-            <w:tcW w:type="dxa" w:w="3216"/>
-            <w:shd w:fill="1E3A8A"/>
+            <w:tcW w:type="dxa" w:w="864"/>
+            <w:shd w:fill="F1F5F9"/>
             <w:tcMar>
-              <w:top w:w="120" w:type="dxa"/>
-              <w:bottom w:w="120" w:type="dxa"/>
-              <w:left w:w="140" w:type="dxa"/>
-              <w:right w:w="140" w:type="dxa"/>
+              <w:top w:w="100" w:type="dxa"/>
+              <w:bottom w:w="100" w:type="dxa"/>
+              <w:left w:w="100" w:type="dxa"/>
+              <w:right w:w="100" w:type="dxa"/>
+            </w:tcMar>
+          </w:tcPr>
+          <w:p>
+            <w:pPr>
+              <w:jc w:val="center"/>
+            </w:pPr>
+            <w:r>
+              <w:rPr>
+                <w:b/>
+                <w:color w:val="0F172A"/>
+                <w:sz w:val="19"/>
+              </w:rPr>
+              <w:t>STT</w:t>
+            </w:r>
+          </w:p>
+        </w:tc>
+        <w:tc>
+          <w:tcPr>
+            <w:tcW w:type="dxa" w:w="3168"/>
+            <w:shd w:fill="F1F5F9"/>
+            <w:tcMar>
+              <w:top w:w="100" w:type="dxa"/>
+              <w:bottom w:w="100" w:type="dxa"/>
+              <w:left w:w="100" w:type="dxa"/>
+              <w:right w:w="100" w:type="dxa"/>
             </w:tcMar>
           </w:tcPr>
           <w:p>
             <w:r>
               <w:rPr>
                 <w:b/>
-                <w:color w:val="FFFFFF"/>
-                <w:sz w:val="20"/>
+                <w:color w:val="0F172A"/>
+                <w:sz w:val="19"/>
               </w:rPr>
-              <w:t>Mục Checklist</w:t>
+              <w:t>Yêu cầu Checklist</w:t>
             </w:r>
           </w:p>
         </w:tc>
         <w:tc>
           <w:tcPr>
-            <w:tcW w:type="dxa" w:w="3216"/>
-            <w:shd w:fill="1E3A8A"/>
+            <w:tcW w:type="dxa" w:w="4320"/>
+            <w:shd w:fill="F1F5F9"/>
             <w:tcMar>
-              <w:top w:w="120" w:type="dxa"/>
-              <w:bottom w:w="120" w:type="dxa"/>
-              <w:left w:w="140" w:type="dxa"/>
-              <w:right w:w="140" w:type="dxa"/>
+              <w:top w:w="100" w:type="dxa"/>
+              <w:bottom w:w="100" w:type="dxa"/>
+              <w:left w:w="100" w:type="dxa"/>
+              <w:right w:w="100" w:type="dxa"/>
             </w:tcMar>
           </w:tcPr>
           <w:p>
             <w:r>
               <w:rPr>
                 <w:b/>
-                <w:color w:val="FFFFFF"/>
-                <w:sz w:val="20"/>
+                <w:color w:val="0F172A"/>
+                <w:sz w:val="19"/>
               </w:rPr>
-              <w:t>Yêu cầu của đề bài</w:t>
+              <w:t>Nội dung triển khai kỹ thuật</w:t>
             </w:r>
           </w:p>
         </w:tc>
         <w:tc>
           <w:tcPr>
-            <w:tcW w:type="dxa" w:w="3216"/>
-            <w:shd w:fill="1E3A8A"/>
+            <w:tcW w:type="dxa" w:w="1296"/>
+            <w:shd w:fill="F1F5F9"/>
             <w:tcMar>
-              <w:top w:w="120" w:type="dxa"/>
-              <w:bottom w:w="120" w:type="dxa"/>
-              <w:left w:w="140" w:type="dxa"/>
-              <w:right w:w="140" w:type="dxa"/>
+              <w:top w:w="100" w:type="dxa"/>
+              <w:bottom w:w="100" w:type="dxa"/>
+              <w:left w:w="100" w:type="dxa"/>
+              <w:right w:w="100" w:type="dxa"/>
             </w:tcMar>
           </w:tcPr>
           <w:p>
+            <w:pPr>
+              <w:jc w:val="center"/>
+            </w:pPr>
             <w:r>
               <w:rPr>
                 <w:b/>
-                <w:color w:val="FFFFFF"/>
-                <w:sz w:val="20"/>
+                <w:color w:val="0F172A"/>
+                <w:sz w:val="19"/>
               </w:rPr>
-              <w:t>Trạng thái thực hiện &amp; Minh chứng</w:t>
+              <w:t>Kết quả</w:t>
             </w:r>
           </w:p>
         </w:tc>
@@ -153,34 +230,37 @@
       <w:tr>
         <w:tc>
           <w:tcPr>
-            <w:tcW w:type="dxa" w:w="3216"/>
-            <w:shd w:fill="F8FAFC"/>
+            <w:tcW w:type="dxa" w:w="864"/>
+            <w:shd w:fill="FFFFFF"/>
             <w:tcMar>
-              <w:top w:w="100" w:type="dxa"/>
-              <w:bottom w:w="100" w:type="dxa"/>
-              <w:left w:w="140" w:type="dxa"/>
-              <w:right w:w="140" w:type="dxa"/>
+              <w:top w:w="80" w:type="dxa"/>
+              <w:bottom w:w="80" w:type="dxa"/>
+              <w:left w:w="100" w:type="dxa"/>
+              <w:right w:w="100" w:type="dxa"/>
             </w:tcMar>
           </w:tcPr>
           <w:p>
+            <w:pPr>
+              <w:jc w:val="center"/>
+            </w:pPr>
             <w:r>
               <w:rPr>
                 <w:b/>
                 <w:sz w:val="19"/>
               </w:rPr>
-              <w:t>Checklist 1</w:t>
+              <w:t>Mục 1</w:t>
             </w:r>
           </w:p>
         </w:tc>
         <w:tc>
           <w:tcPr>
-            <w:tcW w:type="dxa" w:w="3216"/>
-            <w:shd w:fill="F8FAFC"/>
+            <w:tcW w:type="dxa" w:w="3168"/>
+            <w:shd w:fill="FFFFFF"/>
             <w:tcMar>
-              <w:top w:w="100" w:type="dxa"/>
-              <w:bottom w:w="100" w:type="dxa"/>
-              <w:left w:w="140" w:type="dxa"/>
-              <w:right w:w="140" w:type="dxa"/>
+              <w:top w:w="80" w:type="dxa"/>
+              <w:bottom w:w="80" w:type="dxa"/>
+              <w:left w:w="100" w:type="dxa"/>
+              <w:right w:w="100" w:type="dxa"/>
             </w:tcMar>
           </w:tcPr>
           <w:p>
@@ -188,28 +268,51 @@
               <w:rPr>
                 <w:sz w:val="19"/>
               </w:rPr>
-              <w:t>Phân tích yêu cầu chức năng và thiết kế sơ đồ luồng dữ liệu cho ứng dụng quản lý tài liệu.</w:t>
+              <w:t>Phân tích yêu cầu chức năng &amp; thiết kế sơ đồ luồng dữ liệu</w:t>
             </w:r>
           </w:p>
         </w:tc>
         <w:tc>
           <w:tcPr>
-            <w:tcW w:type="dxa" w:w="3216"/>
-            <w:shd w:fill="F8FAFC"/>
+            <w:tcW w:type="dxa" w:w="4320"/>
+            <w:shd w:fill="FFFFFF"/>
             <w:tcMar>
-              <w:top w:w="100" w:type="dxa"/>
-              <w:bottom w:w="100" w:type="dxa"/>
-              <w:left w:w="140" w:type="dxa"/>
-              <w:right w:w="140" w:type="dxa"/>
+              <w:top w:w="80" w:type="dxa"/>
+              <w:bottom w:w="80" w:type="dxa"/>
+              <w:left w:w="100" w:type="dxa"/>
+              <w:right w:w="100" w:type="dxa"/>
             </w:tcMar>
           </w:tcPr>
           <w:p>
             <w:r>
               <w:rPr>
-                <w:color w:val="0F766E"/>
                 <w:sz w:val="19"/>
               </w:rPr>
-              <w:t>✅ HOÀN THÀNH 100%: Có bảng phân tích 5 chức năng, sơ đồ ERD, sơ đồ phân tầng kiến trúc và Sequence Diagram luồng Reactive Stream.</w:t>
+              <w:t>Phân tích 5 nhóm nghiệp vụ; thiết kế mô hình dữ liệu quan hệ (ERD); xây dựng sơ đồ DFD Cấp 0, DFD Cấp 1 và Sequence Diagram cho luồng Reactive Stream.</w:t>
+            </w:r>
+          </w:p>
+        </w:tc>
+        <w:tc>
+          <w:tcPr>
+            <w:tcW w:type="dxa" w:w="1296"/>
+            <w:shd w:fill="FFFFFF"/>
+            <w:tcMar>
+              <w:top w:w="80" w:type="dxa"/>
+              <w:bottom w:w="80" w:type="dxa"/>
+              <w:left w:w="100" w:type="dxa"/>
+              <w:right w:w="100" w:type="dxa"/>
+            </w:tcMar>
+          </w:tcPr>
+          <w:p>
+            <w:pPr>
+              <w:jc w:val="center"/>
+            </w:pPr>
+            <w:r>
+              <w:rPr>
+                <w:b/>
+                <w:sz w:val="19"/>
+              </w:rPr>
+              <w:t>Đạt</w:t>
             </w:r>
           </w:p>
         </w:tc>
@@ -217,34 +320,37 @@
       <w:tr>
         <w:tc>
           <w:tcPr>
-            <w:tcW w:type="dxa" w:w="3216"/>
+            <w:tcW w:type="dxa" w:w="864"/>
             <w:shd w:fill="FFFFFF"/>
             <w:tcMar>
-              <w:top w:w="100" w:type="dxa"/>
-              <w:bottom w:w="100" w:type="dxa"/>
-              <w:left w:w="140" w:type="dxa"/>
-              <w:right w:w="140" w:type="dxa"/>
+              <w:top w:w="80" w:type="dxa"/>
+              <w:bottom w:w="80" w:type="dxa"/>
+              <w:left w:w="100" w:type="dxa"/>
+              <w:right w:w="100" w:type="dxa"/>
             </w:tcMar>
           </w:tcPr>
           <w:p>
+            <w:pPr>
+              <w:jc w:val="center"/>
+            </w:pPr>
             <w:r>
               <w:rPr>
                 <w:b/>
                 <w:sz w:val="19"/>
               </w:rPr>
-              <w:t>Checklist 2</w:t>
+              <w:t>Mục 2</w:t>
             </w:r>
           </w:p>
         </w:tc>
         <w:tc>
           <w:tcPr>
-            <w:tcW w:type="dxa" w:w="3216"/>
+            <w:tcW w:type="dxa" w:w="3168"/>
             <w:shd w:fill="FFFFFF"/>
             <w:tcMar>
-              <w:top w:w="100" w:type="dxa"/>
-              <w:bottom w:w="100" w:type="dxa"/>
-              <w:left w:w="140" w:type="dxa"/>
-              <w:right w:w="140" w:type="dxa"/>
+              <w:top w:w="80" w:type="dxa"/>
+              <w:bottom w:w="80" w:type="dxa"/>
+              <w:left w:w="100" w:type="dxa"/>
+              <w:right w:w="100" w:type="dxa"/>
             </w:tcMar>
           </w:tcPr>
           <w:p>
@@ -252,28 +358,51 @@
               <w:rPr>
                 <w:sz w:val="19"/>
               </w:rPr>
-              <w:t>Thiết lập cấu trúc thư mục và phân lớp hệ thống theo đúng tiêu chuẩn của kiến trúc Cashew.</w:t>
+              <w:t>Thiết lập cấu trúc thư mục &amp; phân lớp chuẩn kiến trúc Cashew</w:t>
             </w:r>
           </w:p>
         </w:tc>
         <w:tc>
           <w:tcPr>
-            <w:tcW w:type="dxa" w:w="3216"/>
+            <w:tcW w:type="dxa" w:w="4320"/>
             <w:shd w:fill="FFFFFF"/>
             <w:tcMar>
-              <w:top w:w="100" w:type="dxa"/>
-              <w:bottom w:w="100" w:type="dxa"/>
-              <w:left w:w="140" w:type="dxa"/>
-              <w:right w:w="140" w:type="dxa"/>
+              <w:top w:w="80" w:type="dxa"/>
+              <w:bottom w:w="80" w:type="dxa"/>
+              <w:left w:w="100" w:type="dxa"/>
+              <w:right w:w="100" w:type="dxa"/>
             </w:tcMar>
           </w:tcPr>
           <w:p>
             <w:r>
               <w:rPr>
-                <w:color w:val="0F766E"/>
                 <w:sz w:val="19"/>
               </w:rPr>
-              <w:t>✅ HOÀN THÀNH 100%: Phân tách triệt để 5 tầng độc lập: lib/database, lib/struct, lib/pages, lib/widgets, colors.dart &amp; functions.dart.</w:t>
+              <w:t>Tổ chức 5 tầng độc lập: lib/database/ (Data Layer), lib/struct/ (Business/State Layer), lib/pages/ (View Layer), lib/widgets/ (Component Layer), tiện ích dùng chung.</w:t>
+            </w:r>
+          </w:p>
+        </w:tc>
+        <w:tc>
+          <w:tcPr>
+            <w:tcW w:type="dxa" w:w="1296"/>
+            <w:shd w:fill="FFFFFF"/>
+            <w:tcMar>
+              <w:top w:w="80" w:type="dxa"/>
+              <w:bottom w:w="80" w:type="dxa"/>
+              <w:left w:w="100" w:type="dxa"/>
+              <w:right w:w="100" w:type="dxa"/>
+            </w:tcMar>
+          </w:tcPr>
+          <w:p>
+            <w:pPr>
+              <w:jc w:val="center"/>
+            </w:pPr>
+            <w:r>
+              <w:rPr>
+                <w:b/>
+                <w:sz w:val="19"/>
+              </w:rPr>
+              <w:t>Đạt</w:t>
             </w:r>
           </w:p>
         </w:tc>
@@ -281,34 +410,37 @@
       <w:tr>
         <w:tc>
           <w:tcPr>
-            <w:tcW w:type="dxa" w:w="3216"/>
-            <w:shd w:fill="F8FAFC"/>
+            <w:tcW w:type="dxa" w:w="864"/>
+            <w:shd w:fill="FFFFFF"/>
             <w:tcMar>
-              <w:top w:w="100" w:type="dxa"/>
-              <w:bottom w:w="100" w:type="dxa"/>
-              <w:left w:w="140" w:type="dxa"/>
-              <w:right w:w="140" w:type="dxa"/>
+              <w:top w:w="80" w:type="dxa"/>
+              <w:bottom w:w="80" w:type="dxa"/>
+              <w:left w:w="100" w:type="dxa"/>
+              <w:right w:w="100" w:type="dxa"/>
             </w:tcMar>
           </w:tcPr>
           <w:p>
+            <w:pPr>
+              <w:jc w:val="center"/>
+            </w:pPr>
             <w:r>
               <w:rPr>
                 <w:b/>
                 <w:sz w:val="19"/>
               </w:rPr>
-              <w:t>Checklist 3</w:t>
+              <w:t>Mục 3</w:t>
             </w:r>
           </w:p>
         </w:tc>
         <w:tc>
           <w:tcPr>
-            <w:tcW w:type="dxa" w:w="3216"/>
-            <w:shd w:fill="F8FAFC"/>
+            <w:tcW w:type="dxa" w:w="3168"/>
+            <w:shd w:fill="FFFFFF"/>
             <w:tcMar>
-              <w:top w:w="100" w:type="dxa"/>
-              <w:bottom w:w="100" w:type="dxa"/>
-              <w:left w:w="140" w:type="dxa"/>
-              <w:right w:w="140" w:type="dxa"/>
+              <w:top w:w="80" w:type="dxa"/>
+              <w:bottom w:w="80" w:type="dxa"/>
+              <w:left w:w="100" w:type="dxa"/>
+              <w:right w:w="100" w:type="dxa"/>
             </w:tcMar>
           </w:tcPr>
           <w:p>
@@ -316,28 +448,51 @@
               <w:rPr>
                 <w:sz w:val="19"/>
               </w:rPr>
-              <w:t>Triển khai các chức năng cốt lõi: Thêm, sửa, xóa và tìm kiếm tài liệu học tập.</w:t>
+              <w:t>Triển khai các chức năng cốt lõi: Thêm, sửa, xóa, tìm kiếm</w:t>
             </w:r>
           </w:p>
         </w:tc>
         <w:tc>
           <w:tcPr>
-            <w:tcW w:type="dxa" w:w="3216"/>
-            <w:shd w:fill="F8FAFC"/>
+            <w:tcW w:type="dxa" w:w="4320"/>
+            <w:shd w:fill="FFFFFF"/>
             <w:tcMar>
-              <w:top w:w="100" w:type="dxa"/>
-              <w:bottom w:w="100" w:type="dxa"/>
-              <w:left w:w="140" w:type="dxa"/>
-              <w:right w:w="140" w:type="dxa"/>
+              <w:top w:w="80" w:type="dxa"/>
+              <w:bottom w:w="80" w:type="dxa"/>
+              <w:left w:w="100" w:type="dxa"/>
+              <w:right w:w="100" w:type="dxa"/>
             </w:tcMar>
           </w:tcPr>
           <w:p>
             <w:r>
               <w:rPr>
-                <w:color w:val="0F766E"/>
                 <w:sz w:val="19"/>
               </w:rPr>
-              <w:t>✅ HOÀN THÀNH 100%: Triển khai đầy đủ CRUD, DatePicker deadline, tìm kiếm full-text tức thì, bộ lọc đa tiêu chí (Môn học, Loại tài liệu, Yêu thích).</w:t>
+              <w:t>Hoàn thành CRUD tài liệu, chọn deadline bài tập, tìm kiếm full-text đa trường, bộ lọc kết hợp (Môn học, Loại tài liệu, Yêu thích, Bài tập chờ).</w:t>
+            </w:r>
+          </w:p>
+        </w:tc>
+        <w:tc>
+          <w:tcPr>
+            <w:tcW w:type="dxa" w:w="1296"/>
+            <w:shd w:fill="FFFFFF"/>
+            <w:tcMar>
+              <w:top w:w="80" w:type="dxa"/>
+              <w:bottom w:w="80" w:type="dxa"/>
+              <w:left w:w="100" w:type="dxa"/>
+              <w:right w:w="100" w:type="dxa"/>
+            </w:tcMar>
+          </w:tcPr>
+          <w:p>
+            <w:pPr>
+              <w:jc w:val="center"/>
+            </w:pPr>
+            <w:r>
+              <w:rPr>
+                <w:b/>
+                <w:sz w:val="19"/>
+              </w:rPr>
+              <w:t>Đạt</w:t>
             </w:r>
           </w:p>
         </w:tc>
@@ -345,34 +500,37 @@
       <w:tr>
         <w:tc>
           <w:tcPr>
-            <w:tcW w:type="dxa" w:w="3216"/>
+            <w:tcW w:type="dxa" w:w="864"/>
             <w:shd w:fill="FFFFFF"/>
             <w:tcMar>
-              <w:top w:w="100" w:type="dxa"/>
-              <w:bottom w:w="100" w:type="dxa"/>
-              <w:left w:w="140" w:type="dxa"/>
-              <w:right w:w="140" w:type="dxa"/>
+              <w:top w:w="80" w:type="dxa"/>
+              <w:bottom w:w="80" w:type="dxa"/>
+              <w:left w:w="100" w:type="dxa"/>
+              <w:right w:w="100" w:type="dxa"/>
             </w:tcMar>
           </w:tcPr>
           <w:p>
+            <w:pPr>
+              <w:jc w:val="center"/>
+            </w:pPr>
             <w:r>
               <w:rPr>
                 <w:b/>
                 <w:sz w:val="19"/>
               </w:rPr>
-              <w:t>Checklist 4</w:t>
+              <w:t>Mục 4</w:t>
             </w:r>
           </w:p>
         </w:tc>
         <w:tc>
           <w:tcPr>
-            <w:tcW w:type="dxa" w:w="3216"/>
+            <w:tcW w:type="dxa" w:w="3168"/>
             <w:shd w:fill="FFFFFF"/>
             <w:tcMar>
-              <w:top w:w="100" w:type="dxa"/>
-              <w:bottom w:w="100" w:type="dxa"/>
-              <w:left w:w="140" w:type="dxa"/>
-              <w:right w:w="140" w:type="dxa"/>
+              <w:top w:w="80" w:type="dxa"/>
+              <w:bottom w:w="80" w:type="dxa"/>
+              <w:left w:w="100" w:type="dxa"/>
+              <w:right w:w="100" w:type="dxa"/>
             </w:tcMar>
           </w:tcPr>
           <w:p>
@@ -380,28 +538,51 @@
               <w:rPr>
                 <w:sz w:val="19"/>
               </w:rPr>
-              <w:t>Kiểm thử tính đúng đắn của việc phân tách logic giữa các lớp trong kiến trúc.</w:t>
+              <w:t>Kiểm thử tính đúng đắn của việc phân tách logic giữa các lớp</w:t>
             </w:r>
           </w:p>
         </w:tc>
         <w:tc>
           <w:tcPr>
-            <w:tcW w:type="dxa" w:w="3216"/>
+            <w:tcW w:type="dxa" w:w="4320"/>
             <w:shd w:fill="FFFFFF"/>
             <w:tcMar>
-              <w:top w:w="100" w:type="dxa"/>
-              <w:bottom w:w="100" w:type="dxa"/>
-              <w:left w:w="140" w:type="dxa"/>
-              <w:right w:w="140" w:type="dxa"/>
+              <w:top w:w="80" w:type="dxa"/>
+              <w:bottom w:w="80" w:type="dxa"/>
+              <w:left w:w="100" w:type="dxa"/>
+              <w:right w:w="100" w:type="dxa"/>
             </w:tcMar>
           </w:tcPr>
           <w:p>
             <w:r>
               <w:rPr>
-                <w:color w:val="0F766E"/>
                 <w:sz w:val="19"/>
               </w:rPr>
-              <w:t>✅ HOÀN THÀNH 100%: 12/12 test case vượt qua (test/database_test.dart, test/service_test.dart, test/widget_test.dart). flutter analyze: 0 lỗi.</w:t>
+              <w:t>Xây dựng 12 automated test cases trên cả 3 tầng: database_test.dart (6), service_test.dart (5), widget_test.dart (1). Kết quả: 12/12 pass, flutter analyze: 0 lỗi.</w:t>
+            </w:r>
+          </w:p>
+        </w:tc>
+        <w:tc>
+          <w:tcPr>
+            <w:tcW w:type="dxa" w:w="1296"/>
+            <w:shd w:fill="FFFFFF"/>
+            <w:tcMar>
+              <w:top w:w="80" w:type="dxa"/>
+              <w:bottom w:w="80" w:type="dxa"/>
+              <w:left w:w="100" w:type="dxa"/>
+              <w:right w:w="100" w:type="dxa"/>
+            </w:tcMar>
+          </w:tcPr>
+          <w:p>
+            <w:pPr>
+              <w:jc w:val="center"/>
+            </w:pPr>
+            <w:r>
+              <w:rPr>
+                <w:b/>
+                <w:sz w:val="19"/>
+              </w:rPr>
+              <w:t>Đạt</w:t>
             </w:r>
           </w:p>
         </w:tc>
@@ -409,34 +590,37 @@
       <w:tr>
         <w:tc>
           <w:tcPr>
-            <w:tcW w:type="dxa" w:w="3216"/>
-            <w:shd w:fill="F8FAFC"/>
+            <w:tcW w:type="dxa" w:w="864"/>
+            <w:shd w:fill="FFFFFF"/>
             <w:tcMar>
-              <w:top w:w="100" w:type="dxa"/>
-              <w:bottom w:w="100" w:type="dxa"/>
-              <w:left w:w="140" w:type="dxa"/>
-              <w:right w:w="140" w:type="dxa"/>
+              <w:top w:w="80" w:type="dxa"/>
+              <w:bottom w:w="80" w:type="dxa"/>
+              <w:left w:w="100" w:type="dxa"/>
+              <w:right w:w="100" w:type="dxa"/>
             </w:tcMar>
           </w:tcPr>
           <w:p>
+            <w:pPr>
+              <w:jc w:val="center"/>
+            </w:pPr>
             <w:r>
               <w:rPr>
                 <w:b/>
                 <w:sz w:val="19"/>
               </w:rPr>
-              <w:t>Checklist 5</w:t>
+              <w:t>Mục 5</w:t>
             </w:r>
           </w:p>
         </w:tc>
         <w:tc>
           <w:tcPr>
-            <w:tcW w:type="dxa" w:w="3216"/>
-            <w:shd w:fill="F8FAFC"/>
+            <w:tcW w:type="dxa" w:w="3168"/>
+            <w:shd w:fill="FFFFFF"/>
             <w:tcMar>
-              <w:top w:w="100" w:type="dxa"/>
-              <w:bottom w:w="100" w:type="dxa"/>
-              <w:left w:w="140" w:type="dxa"/>
-              <w:right w:w="140" w:type="dxa"/>
+              <w:top w:w="80" w:type="dxa"/>
+              <w:bottom w:w="80" w:type="dxa"/>
+              <w:left w:w="100" w:type="dxa"/>
+              <w:right w:w="100" w:type="dxa"/>
             </w:tcMar>
           </w:tcPr>
           <w:p>
@@ -444,28 +628,51 @@
               <w:rPr>
                 <w:sz w:val="19"/>
               </w:rPr>
-              <w:t>Đóng gói mã nguồn và viết báo cáo giải trình về cách áp dụng kiến trúc Cashew vào dự án.</w:t>
+              <w:t>Đóng gói mã nguồn và lập báo cáo giải trình kiến trúc</w:t>
             </w:r>
           </w:p>
         </w:tc>
         <w:tc>
           <w:tcPr>
-            <w:tcW w:type="dxa" w:w="3216"/>
-            <w:shd w:fill="F8FAFC"/>
+            <w:tcW w:type="dxa" w:w="4320"/>
+            <w:shd w:fill="FFFFFF"/>
             <w:tcMar>
-              <w:top w:w="100" w:type="dxa"/>
-              <w:bottom w:w="100" w:type="dxa"/>
-              <w:left w:w="140" w:type="dxa"/>
-              <w:right w:w="140" w:type="dxa"/>
+              <w:top w:w="80" w:type="dxa"/>
+              <w:bottom w:w="80" w:type="dxa"/>
+              <w:left w:w="100" w:type="dxa"/>
+              <w:right w:w="100" w:type="dxa"/>
             </w:tcMar>
           </w:tcPr>
           <w:p>
             <w:r>
               <w:rPr>
-                <w:color w:val="0F766E"/>
                 <w:sz w:val="19"/>
               </w:rPr>
-              <w:t>✅ HOÀN THÀNH 100%: Đã tạo gói zip tối ưu TH1_QuanLyTaiLieuHocTap_Cashew.zip (0.81 MB), báo cáo Markdown và tài liệu Word .docx này.</w:t>
+              <w:t>Đóng gói mã nguồn sạch TH1_QuanLyTaiLieuHocTap_Cashew.zip (0.85 MB); biên soạn tài liệu giải trình chi tiết về kiến trúc hệ thống.</w:t>
+            </w:r>
+          </w:p>
+        </w:tc>
+        <w:tc>
+          <w:tcPr>
+            <w:tcW w:type="dxa" w:w="1296"/>
+            <w:shd w:fill="FFFFFF"/>
+            <w:tcMar>
+              <w:top w:w="80" w:type="dxa"/>
+              <w:bottom w:w="80" w:type="dxa"/>
+              <w:left w:w="100" w:type="dxa"/>
+              <w:right w:w="100" w:type="dxa"/>
+            </w:tcMar>
+          </w:tcPr>
+          <w:p>
+            <w:pPr>
+              <w:jc w:val="center"/>
+            </w:pPr>
+            <w:r>
+              <w:rPr>
+                <w:b/>
+                <w:sz w:val="19"/>
+              </w:rPr>
+              <w:t>Đạt</w:t>
             </w:r>
           </w:p>
         </w:tc>
@@ -473,50 +680,92 @@
     </w:tbl>
     <w:p>
       <w:pPr>
-        <w:spacing w:after="320"/>
+        <w:spacing w:after="240"/>
       </w:pPr>
     </w:p>
     <w:p>
       <w:pPr>
-        <w:spacing w:before="320" w:after="160"/>
+        <w:keepNext/>
+        <w:spacing w:before="320" w:after="120"/>
       </w:pPr>
       <w:r>
         <w:rPr>
+          <w:rFonts w:ascii="Calibri" w:hAnsi="Calibri"/>
           <w:b/>
-          <w:color w:val="1E3A8A"/>
-          <w:sz w:val="28"/>
+          <w:color w:val="0F172A"/>
+          <w:sz w:val="27"/>
         </w:rPr>
-        <w:t>CHI TIẾT CHECKLIST 1: PHÂN TÍCH YÊU CẦU &amp; SƠ ĐỒ LUỒNG DỮ LIỆU</w:t>
+        <w:t>MỤC I: PHÂN TÍCH YÊU CẦU CHỨC NĂNG VÀ THIẾT KẾ SƠ ĐỒ LUỒNG DỮ LIỆU (CHECKLIST 1)</w:t>
+      </w:r>
+    </w:p>
+    <w:p>
+      <w:pPr>
+        <w:keepNext/>
+        <w:spacing w:before="240" w:after="80"/>
+      </w:pPr>
+      <w:r>
+        <w:rPr>
+          <w:rFonts w:ascii="Calibri" w:hAnsi="Calibri"/>
+          <w:b/>
+          <w:color w:val="1E293B"/>
+          <w:sz w:val="23"/>
+        </w:rPr>
+        <w:t>1.1. Phân tích yêu cầu chức năng nghiệp vụ</w:t>
       </w:r>
     </w:p>
     <w:p>
       <w:r>
-        <w:t>Sinh viên đã tiến hành khảo sát và phân tích toàn diện nhu cầu quản lý tài liệu học tập của sinh viên đại học. Ứng dụng tập trung vào 5 nhóm yêu cầu cốt lõi sau:</w:t>
+        <w:t>Hệ thống quản lý tài liệu học tập được thiết kế nhằm hỗ trợ sinh viên lưu trữ, sắp xếp và theo dõi tiến độ hoàn thành bài tập. Các chức năng nghiệp vụ chính bao gồm:</w:t>
       </w:r>
     </w:p>
     <w:p>
       <w:r>
-        <w:t>1. Quản lý Môn học (Subjects): Mỗi tài liệu bắt buộc phải thuộc một môn học xác định (ví dụ: Lập trình Thiết bị Di động, Cấu trúc Dữ liệu &amp; Giải thuật...). Môn học được phân định bằng Mã học phần (code) và Mã màu sắc (colorValue) để nhận diện nhanh trên giao diện.</w:t>
+        <w:t>• Quản lý Môn học (Subjects): Mỗi tài liệu thuộc về một môn học cụ thể. Môn học có Tên môn, Mã học phần và Màu sắc nhận diện riêng để hỗ trợ hiển thị trực quan.</w:t>
       </w:r>
     </w:p>
     <w:p>
       <w:r>
-        <w:t>2. Quản lý Phân loại Tài liệu: Chia làm 4 loại rõ rệt (Bài giảng - lecture, Bài tập - assignment, Tài liệu tham khảo - reference, Đề thi ôn tập - exam). Mỗi loại có hệ màu sắc nhận diện Tonal Badge riêng biệt theo chuẩn Material 3.</w:t>
+        <w:t>• Quản lý Phân loại Tài liệu (Document Types): Hỗ trợ 4 loại tài liệu gồm Bài giảng (Lecture), Bài tập (Assignment), Tài liệu tham khảo (Reference), Đề thi ôn tập (Exam).</w:t>
       </w:r>
     </w:p>
     <w:p>
       <w:r>
-        <w:t>3. Quản lý Deadline Bài tập: Với tài liệu loại Bài tập, hệ thống cung cấp bộ chọn Ngày &amp; Giờ nộp bài (DatePicker / TimePicker) và tự động tính toán số ngày còn lại (Hạn chót hôm nay, Còn 2 ngày, Quá hạn N ngày).</w:t>
+        <w:t>• Quản lý Hạn nộp (Deadline Management): Áp dụng cho các tài liệu dạng Bài tập. Cho phép thiết lập ngày giờ nộp bài và tự động tính toán thời hạn (còn hạn, quá hạn, đã nộp).</w:t>
       </w:r>
     </w:p>
     <w:p>
       <w:r>
-        <w:t>4. Thao tác Dữ liệu Tức thì (Reactive Streams): Mọi thay đổi dữ liệu (thêm mới, chỉnh sửa, xóa, đánh dấu sao) phản hồi trực tiếp lên màn hình mà không cần reload trang.</w:t>
+        <w:t>• Tìm kiếm và Lọc đa tiêu chí: Tra cứu tức thời theo từ khóa trong tiêu đề/ghi chú kết hợp lọc theo Môn học, Loại tài liệu, Trạng thái bài tập chờ và Đánh dấu quan trọng.</w:t>
+      </w:r>
+    </w:p>
+    <w:p>
+      <w:pPr>
+        <w:keepNext/>
+        <w:spacing w:before="240" w:after="80"/>
+      </w:pPr>
+      <w:r>
+        <w:rPr>
+          <w:rFonts w:ascii="Calibri" w:hAnsi="Calibri"/>
+          <w:b/>
+          <w:color w:val="1E293B"/>
+          <w:sz w:val="23"/>
+        </w:rPr>
+        <w:t>1.2. Thiết kế Cơ sở dữ liệu và Ràng buộc toàn vẹn</w:t>
       </w:r>
     </w:p>
     <w:p>
       <w:r>
-        <w:t>5. Tìm kiếm &amp; Lọc Đa tiêu chí: Hỗ trợ tìm kiếm theo từ khóa trong tiêu đề/ghi chú kết hợp lọc đồng thời theo môn học và loại tài liệu.</w:t>
+        <w:t>Cơ sở dữ liệu SQLite cục bộ được xây dựng với 2 bảng quan hệ:</w:t>
+      </w:r>
+    </w:p>
+    <w:p>
+      <w:r>
+        <w:t>• Bảng subjects: id (TEXT PRIMARY KEY), name (TEXT NOT NULL), code (TEXT NOT NULL), color_value (INTEGER NOT NULL), date_created (TEXT NOT NULL).</w:t>
+      </w:r>
+    </w:p>
+    <w:p>
+      <w:r>
+        <w:t>• Bảng documents: id (TEXT PRIMARY KEY), title (TEXT NOT NULL), subject_id (TEXT NOT NULL), type (TEXT NOT NULL), file_url (TEXT), file_type (TEXT), file_size (INTEGER), note (TEXT), is_favorite (INTEGER), is_completed (INTEGER), deadline (TEXT), date_created (TEXT NOT NULL), date_modified (TEXT NOT NULL).</w:t>
       </w:r>
     </w:p>
     <w:tbl>
@@ -526,21 +775,21 @@
         <w:tblLook w:firstColumn="1" w:firstRow="1" w:lastColumn="0" w:lastRow="0" w:noHBand="0" w:noVBand="1" w:val="04A0"/>
       </w:tblPr>
       <w:tblGrid>
-        <w:gridCol w:w="9648"/>
+        <w:gridCol w:w="9360"/>
       </w:tblGrid>
       <w:tr>
         <w:tc>
           <w:tcPr>
-            <w:tcW w:type="dxa" w:w="9648"/>
-            <w:shd w:fill="F1F5F9"/>
+            <w:tcW w:type="dxa" w:w="9360"/>
+            <w:shd w:fill="F8FAFC"/>
             <w:tcMar>
-              <w:top w:w="140" w:type="dxa"/>
-              <w:bottom w:w="140" w:type="dxa"/>
-              <w:left w:w="200" w:type="dxa"/>
-              <w:right w:w="180" w:type="dxa"/>
+              <w:top w:w="120" w:type="dxa"/>
+              <w:bottom w:w="120" w:type="dxa"/>
+              <w:left w:w="160" w:type="dxa"/>
+              <w:right w:w="160" w:type="dxa"/>
             </w:tcMar>
             <w:tcBorders>
-              <w:left w:val="single" w:sz="24" w:space="0" w:color="1E3A8A"/>
+              <w:left w:val="single" w:sz="18" w:space="0" w:color="94A3B8"/>
               <w:top w:val="none"/>
               <w:bottom w:val="none"/>
               <w:right w:val="none"/>
@@ -548,24 +797,24 @@
           </w:tcPr>
           <w:p>
             <w:pPr>
-              <w:spacing w:before="40" w:after="80"/>
+              <w:spacing w:before="40" w:after="40"/>
             </w:pPr>
             <w:r>
               <w:rPr>
                 <w:rFonts w:ascii="Calibri" w:hAnsi="Calibri"/>
                 <w:b/>
-                <w:color w:val="1E3A8A"/>
-                <w:sz w:val="21"/>
+                <w:color w:val="334155"/>
+                <w:sz w:val="20"/>
               </w:rPr>
-              <w:t xml:space="preserve">📌 MÔ HÌNH DỮ LIỆU &amp; RÀNG BUỘC TOÀN VẸN: </w:t>
+              <w:t xml:space="preserve">Ràng buộc toàn vẹn CSDL: </w:t>
             </w:r>
             <w:r>
               <w:rPr>
                 <w:rFonts w:ascii="Calibri" w:hAnsi="Calibri"/>
-                <w:color w:val="334155"/>
+                <w:color w:val="475569"/>
                 <w:sz w:val="20"/>
               </w:rPr>
-              <w:t>Cơ sở dữ liệu được thiết kế gồm 2 bảng: 'subjects' và 'documents'. Khóa ngoại subjectId trong bảng documents tham chiếu đến id của subjects và kích hoạt ON DELETE CASCADE. Chỉ mục (Index) idx_doc_search được thiết lập trên các trường tìm kiếm nhằm đảm bảo tốc độ phản hồi dưới 5ms.</w:t>
+              <w:t>Ràng buộc khóa ngoại: FOREIGN KEY (subject_id) REFERENCES subjects(id) ON DELETE CASCADE. Ràng buộc này đảm bảo khi xóa một môn học, toàn bộ tài liệu thuộc môn học đó sẽ tự động được thu hồi, tránh tình trạng mồ côi dữ liệu (orphaned records). Chỉ mục idx_doc_search được thiết lập trên cột title và note để tối ưu hóa truy vấn tìm kiếm.</w:t>
             </w:r>
           </w:p>
         </w:tc>
@@ -573,46 +822,102 @@
     </w:tbl>
     <w:p>
       <w:pPr>
-        <w:spacing w:after="120"/>
+        <w:spacing w:after="80"/>
       </w:pPr>
     </w:p>
     <w:p>
+      <w:pPr>
+        <w:keepNext/>
+        <w:spacing w:before="240" w:after="80"/>
+      </w:pPr>
       <w:r>
         <w:rPr>
+          <w:rFonts w:ascii="Calibri" w:hAnsi="Calibri"/>
           <w:b/>
+          <w:color w:val="1E293B"/>
+          <w:sz w:val="23"/>
         </w:rPr>
-        <w:t>Luồng Dữ liệu (Data Flow Diagram - DFD):</w:t>
+        <w:t>1.3. Sơ đồ Luồng Dữ liệu (Data Flow Diagram - DFD)</w:t>
       </w:r>
     </w:p>
     <w:p>
       <w:r>
-        <w:t>• Bước 1: Người dùng thao tác trên màn hình UI (HomePage hoặc AddEditDocumentPage).</w:t>
+        <w:t>Luồng xử lý dữ liệu trong hệ thống được phân rã thành các cấp độ:</w:t>
+      </w:r>
+    </w:p>
+    <w:p>
+      <w:r>
+        <w:t>• DFD Cấp 0 (Sơ đồ ngữ cảnh): Sinh viên thực hiện các thao tác (Tra cứu, Thêm, Sửa, Xóa tài liệu) tương tác với Hệ thống Quản lý Tài liệu Học tập; hệ thống thực hiện đọc/ghi dữ liệu vào Bộ nhớ CSDL SQLite cục bộ.</w:t>
+      </w:r>
+    </w:p>
+    <w:p>
+      <w:r>
+        <w:t>• DFD Cấp 1: Bao gồm 4 tiến trình độc lập:</w:t>
         <w:br/>
-        <w:t>• Bước 2: UI gọi hàm xử lý nghiệp vụ tại tầng Struct (DocumentService), tại đây dữ liệu được validate tính hợp lệ.</w:t>
+        <w:t xml:space="preserve">  - Tiến trình 1.0 (Quản lý Môn học): Tiếp nhận yêu cầu tạo mới/xóa môn học từ UI, lưu trữ vào bảng subjects.</w:t>
         <w:br/>
-        <w:t>• Bước 3: DocumentService gọi thể hiện Singleton toàn cục databaseGlobal để chuyển câu lệnh tới tầng Database (AppDatabase).</w:t>
+        <w:t xml:space="preserve">  - Tiến trình 2.0 (Xử lý CRUD Tài liệu): Kiểm tra hợp lệ dữ liệu tại DocumentService, gửi câu lệnh SQL qua AppDatabase để cập nhật bảng documents.</w:t>
         <w:br/>
-        <w:t>• Bước 4: AppDatabase thực thi câu lệnh SQL SQLite cục bộ. Sau khi ghi thành công, nó kích hoạt _notifyChange() bắn sự kiện vào broadcast stream.</w:t>
+        <w:t xml:space="preserve">  - Tiến trình 3.0 (Tra cứu &amp; Bộ lọc): Tiếp nhận từ khóa tìm kiếm và các bộ lọc loại/môn, sinh câu lệnh truy vấn SQLite SELECT WHERE LIKE.</w:t>
         <w:br/>
-        <w:t>• Bước 5: StreamBuilder trên UI đang lắng nghe watchFilteredDocuments() nhận danh sách mới và tự động render lại giao diện.</w:t>
+        <w:t xml:space="preserve">  - Tiến trình 4.0 (Phản hồi Reactive): Sau khi bảng dữ liệu thay đổi, AppDatabase phát sự kiện qua StreamController để cập nhật UI tự động.</w:t>
       </w:r>
     </w:p>
     <w:p>
       <w:pPr>
-        <w:spacing w:before="320" w:after="160"/>
+        <w:keepNext/>
+        <w:spacing w:before="240" w:after="80"/>
       </w:pPr>
       <w:r>
         <w:rPr>
+          <w:rFonts w:ascii="Calibri" w:hAnsi="Calibri"/>
           <w:b/>
-          <w:color w:val="1E3A8A"/>
-          <w:sz w:val="28"/>
+          <w:color w:val="1E293B"/>
+          <w:sz w:val="23"/>
         </w:rPr>
-        <w:t>CHI TIẾT CHECKLIST 2: CẤU TRÚC THƯ MỤC &amp; PHÂN LỚP THEO CHUẨN CASHEW</w:t>
+        <w:t>1.4. Sơ đồ Tuần tự (Sequence Diagram)</w:t>
       </w:r>
     </w:p>
     <w:p>
       <w:r>
-        <w:t>Dự án được tổ chức cấu trúc thư mục và phân lớp chính xác 100% theo kiến trúc mã nguồn mở Cashew (jameskokoska/Cashew):</w:t>
+        <w:t>Trình tự tương tác giữa các tầng kiến trúc trong một thao tác thêm tài liệu:</w:t>
+      </w:r>
+    </w:p>
+    <w:p>
+      <w:r>
+        <w:t>1. Người dùng nhập form và nhấn 'Lưu' tại AddEditDocumentPage.</w:t>
+        <w:br/>
+        <w:t>2. AddEditDocumentPage gọi hàm DocumentService.createDocument(...).</w:t>
+        <w:br/>
+        <w:t>3. DocumentService kiểm tra ràng buộc nghiệp vụ (tiêu đề không rỗng, môn học hợp lệ).</w:t>
+        <w:br/>
+        <w:t>4. DocumentService gọi thể hiện toàn cục database.insertDocument(docItem).</w:t>
+        <w:br/>
+        <w:t>5. AppDatabase thực thi câu lệnh SQL INSERT vào SQLite.</w:t>
+        <w:br/>
+        <w:t>6. AppDatabase gọi nội bộ _notifyChange(), phát danh sách cập nhật vào broadcast stream.</w:t>
+        <w:br/>
+        <w:t>7. StreamBuilder tại HomePage nhận dữ liệu mới và tái dựng giao diện tức thì.</w:t>
+      </w:r>
+    </w:p>
+    <w:p>
+      <w:pPr>
+        <w:keepNext/>
+        <w:spacing w:before="320" w:after="120"/>
+      </w:pPr>
+      <w:r>
+        <w:rPr>
+          <w:rFonts w:ascii="Calibri" w:hAnsi="Calibri"/>
+          <w:b/>
+          <w:color w:val="0F172A"/>
+          <w:sz w:val="27"/>
+        </w:rPr>
+        <w:t>MỤC II: CẤU TRÚC THƯ MỤC VÀ PHÂN LỚP THEO CHUẨN CASHEW (CHECKLIST 2)</w:t>
+      </w:r>
+    </w:p>
+    <w:p>
+      <w:r>
+        <w:t>Kiến trúc Cashew (tham chiếu từ repository mã nguồn mở jameskokoska/Cashew) là mô hình kiến trúc phân tầng dựa trên nguyên tắc Separation of Concerns, kết hợp cơ chế Reactive Data Stream trên nền SQLite. Dự án StudyDoc tổ chức cấu trúc thư mục hoàn toàn tương thích với mô hình này:</w:t>
       </w:r>
     </w:p>
     <w:tbl>
@@ -621,37 +926,37 @@
         <w:jc w:val="center"/>
         <w:tblLook w:firstColumn="1" w:firstRow="1" w:lastColumn="0" w:lastRow="0" w:noHBand="0" w:noVBand="1" w:val="04A0"/>
         <w:tblBorders>
-          <w:top w:val="single" w:sz="4" w:space="0" w:color="CBD5E1"/>
-          <w:bottom w:val="single" w:sz="4" w:space="0" w:color="CBD5E1"/>
+          <w:top w:val="single" w:sz="4" w:space="0" w:color="D1D5DB"/>
+          <w:bottom w:val="single" w:sz="4" w:space="0" w:color="D1D5DB"/>
           <w:left w:val="none"/>
           <w:right w:val="none"/>
-          <w:insideH w:val="single" w:sz="4" w:space="0" w:color="CBD5E1"/>
+          <w:insideH w:val="single" w:sz="4" w:space="0" w:color="D1D5DB"/>
           <w:insideV w:val="none"/>
         </w:tblBorders>
       </w:tblPr>
       <w:tblGrid>
-        <w:gridCol w:w="3216"/>
-        <w:gridCol w:w="3216"/>
-        <w:gridCol w:w="3216"/>
+        <w:gridCol w:w="3120"/>
+        <w:gridCol w:w="3120"/>
+        <w:gridCol w:w="3120"/>
       </w:tblGrid>
       <w:tr>
         <w:tc>
           <w:tcPr>
-            <w:tcW w:type="dxa" w:w="3216"/>
-            <w:shd w:fill="1E3A8A"/>
+            <w:tcW w:type="dxa" w:w="2160"/>
+            <w:shd w:fill="F1F5F9"/>
             <w:tcMar>
-              <w:top w:w="120" w:type="dxa"/>
-              <w:bottom w:w="120" w:type="dxa"/>
-              <w:left w:w="140" w:type="dxa"/>
-              <w:right w:w="140" w:type="dxa"/>
+              <w:top w:w="100" w:type="dxa"/>
+              <w:bottom w:w="100" w:type="dxa"/>
+              <w:left w:w="100" w:type="dxa"/>
+              <w:right w:w="100" w:type="dxa"/>
             </w:tcMar>
           </w:tcPr>
           <w:p>
             <w:r>
               <w:rPr>
                 <w:b/>
-                <w:color w:val="FFFFFF"/>
-                <w:sz w:val="20"/>
+                <w:color w:val="0F172A"/>
+                <w:sz w:val="19"/>
               </w:rPr>
               <w:t>Tầng kiến trúc</w:t>
             </w:r>
@@ -659,45 +964,45 @@
         </w:tc>
         <w:tc>
           <w:tcPr>
-            <w:tcW w:type="dxa" w:w="3216"/>
-            <w:shd w:fill="1E3A8A"/>
+            <w:tcW w:type="dxa" w:w="3600"/>
+            <w:shd w:fill="F1F5F9"/>
             <w:tcMar>
-              <w:top w:w="120" w:type="dxa"/>
-              <w:bottom w:w="120" w:type="dxa"/>
-              <w:left w:w="140" w:type="dxa"/>
-              <w:right w:w="140" w:type="dxa"/>
+              <w:top w:w="100" w:type="dxa"/>
+              <w:bottom w:w="100" w:type="dxa"/>
+              <w:left w:w="100" w:type="dxa"/>
+              <w:right w:w="100" w:type="dxa"/>
             </w:tcMar>
           </w:tcPr>
           <w:p>
             <w:r>
               <w:rPr>
                 <w:b/>
-                <w:color w:val="FFFFFF"/>
-                <w:sz w:val="20"/>
+                <w:color w:val="0F172A"/>
+                <w:sz w:val="19"/>
               </w:rPr>
-              <w:t>Tập tin trong StudyDoc</w:t>
+              <w:t>Tập tin trong dự án StudyDoc</w:t>
             </w:r>
           </w:p>
         </w:tc>
         <w:tc>
           <w:tcPr>
-            <w:tcW w:type="dxa" w:w="3216"/>
-            <w:shd w:fill="1E3A8A"/>
+            <w:tcW w:type="dxa" w:w="3888"/>
+            <w:shd w:fill="F1F5F9"/>
             <w:tcMar>
-              <w:top w:w="120" w:type="dxa"/>
-              <w:bottom w:w="120" w:type="dxa"/>
-              <w:left w:w="140" w:type="dxa"/>
-              <w:right w:w="140" w:type="dxa"/>
+              <w:top w:w="100" w:type="dxa"/>
+              <w:bottom w:w="100" w:type="dxa"/>
+              <w:left w:w="100" w:type="dxa"/>
+              <w:right w:w="100" w:type="dxa"/>
             </w:tcMar>
           </w:tcPr>
           <w:p>
             <w:r>
               <w:rPr>
                 <w:b/>
-                <w:color w:val="FFFFFF"/>
-                <w:sz w:val="20"/>
+                <w:color w:val="0F172A"/>
+                <w:sz w:val="19"/>
               </w:rPr>
-              <w:t>Đối chiếu với Cashew gốc &amp; Trách nhiệm</w:t>
+              <w:t>Đối chiếu Cashew gốc &amp; Trách nhiệm</w:t>
             </w:r>
           </w:p>
         </w:tc>
@@ -705,13 +1010,13 @@
       <w:tr>
         <w:tc>
           <w:tcPr>
-            <w:tcW w:type="dxa" w:w="3216"/>
-            <w:shd w:fill="F8FAFC"/>
+            <w:tcW w:type="dxa" w:w="2160"/>
+            <w:shd w:fill="FFFFFF"/>
             <w:tcMar>
-              <w:top w:w="100" w:type="dxa"/>
-              <w:bottom w:w="100" w:type="dxa"/>
-              <w:left w:w="140" w:type="dxa"/>
-              <w:right w:w="140" w:type="dxa"/>
+              <w:top w:w="80" w:type="dxa"/>
+              <w:bottom w:w="80" w:type="dxa"/>
+              <w:left w:w="100" w:type="dxa"/>
+              <w:right w:w="100" w:type="dxa"/>
             </w:tcMar>
           </w:tcPr>
           <w:p>
@@ -720,19 +1025,21 @@
                 <w:b/>
                 <w:sz w:val="19"/>
               </w:rPr>
-              <w:t>Database Layer</w:t>
+              <w:t>Tầng Database</w:t>
+              <w:br/>
+              <w:t>(Data Layer)</w:t>
             </w:r>
           </w:p>
         </w:tc>
         <w:tc>
           <w:tcPr>
-            <w:tcW w:type="dxa" w:w="3216"/>
-            <w:shd w:fill="F8FAFC"/>
+            <w:tcW w:type="dxa" w:w="3600"/>
+            <w:shd w:fill="FFFFFF"/>
             <w:tcMar>
-              <w:top w:w="100" w:type="dxa"/>
-              <w:bottom w:w="100" w:type="dxa"/>
-              <w:left w:w="140" w:type="dxa"/>
-              <w:right w:w="140" w:type="dxa"/>
+              <w:top w:w="80" w:type="dxa"/>
+              <w:bottom w:w="80" w:type="dxa"/>
+              <w:left w:w="100" w:type="dxa"/>
+              <w:right w:w="100" w:type="dxa"/>
             </w:tcMar>
           </w:tcPr>
           <w:p>
@@ -750,13 +1057,13 @@
         </w:tc>
         <w:tc>
           <w:tcPr>
-            <w:tcW w:type="dxa" w:w="3216"/>
-            <w:shd w:fill="F8FAFC"/>
+            <w:tcW w:type="dxa" w:w="3888"/>
+            <w:shd w:fill="FFFFFF"/>
             <w:tcMar>
-              <w:top w:w="100" w:type="dxa"/>
-              <w:bottom w:w="100" w:type="dxa"/>
-              <w:left w:w="140" w:type="dxa"/>
-              <w:right w:w="140" w:type="dxa"/>
+              <w:top w:w="80" w:type="dxa"/>
+              <w:bottom w:w="80" w:type="dxa"/>
+              <w:left w:w="100" w:type="dxa"/>
+              <w:right w:w="100" w:type="dxa"/>
             </w:tcMar>
           </w:tcPr>
           <w:p>
@@ -764,7 +1071,7 @@
               <w:rPr>
                 <w:sz w:val="19"/>
               </w:rPr>
-              <w:t>Tương ứng database/tables.dart &amp; initializeDefaultDatabase.dart trong Cashew. Chịu trách nhiệm định nghĩa schema bảng, CRUD queries, Seed dữ liệu mặc định và phát luồng Stream.</w:t>
+              <w:t>Tương ứng database/tables.dart &amp; initializeDefaultDatabase.dart. Quản lý schema DDL, mở kết nối SQLite, thực thi CRUD, cung cấp StreamController phát dữ liệu.</w:t>
             </w:r>
           </w:p>
         </w:tc>
@@ -772,13 +1079,13 @@
       <w:tr>
         <w:tc>
           <w:tcPr>
-            <w:tcW w:type="dxa" w:w="3216"/>
+            <w:tcW w:type="dxa" w:w="2160"/>
             <w:shd w:fill="FFFFFF"/>
             <w:tcMar>
-              <w:top w:w="100" w:type="dxa"/>
-              <w:bottom w:w="100" w:type="dxa"/>
-              <w:left w:w="140" w:type="dxa"/>
-              <w:right w:w="140" w:type="dxa"/>
+              <w:top w:w="80" w:type="dxa"/>
+              <w:bottom w:w="80" w:type="dxa"/>
+              <w:left w:w="100" w:type="dxa"/>
+              <w:right w:w="100" w:type="dxa"/>
             </w:tcMar>
           </w:tcPr>
           <w:p>
@@ -787,19 +1094,21 @@
                 <w:b/>
                 <w:sz w:val="19"/>
               </w:rPr>
-              <w:t>Struct Layer (Global)</w:t>
+              <w:t>Tầng Struct</w:t>
+              <w:br/>
+              <w:t>(Global Instance)</w:t>
             </w:r>
           </w:p>
         </w:tc>
         <w:tc>
           <w:tcPr>
-            <w:tcW w:type="dxa" w:w="3216"/>
+            <w:tcW w:type="dxa" w:w="3600"/>
             <w:shd w:fill="FFFFFF"/>
             <w:tcMar>
-              <w:top w:w="100" w:type="dxa"/>
-              <w:bottom w:w="100" w:type="dxa"/>
-              <w:left w:w="140" w:type="dxa"/>
-              <w:right w:w="140" w:type="dxa"/>
+              <w:top w:w="80" w:type="dxa"/>
+              <w:bottom w:w="80" w:type="dxa"/>
+              <w:left w:w="100" w:type="dxa"/>
+              <w:right w:w="100" w:type="dxa"/>
             </w:tcMar>
           </w:tcPr>
           <w:p>
@@ -813,13 +1122,13 @@
         </w:tc>
         <w:tc>
           <w:tcPr>
-            <w:tcW w:type="dxa" w:w="3216"/>
+            <w:tcW w:type="dxa" w:w="3888"/>
             <w:shd w:fill="FFFFFF"/>
             <w:tcMar>
-              <w:top w:w="100" w:type="dxa"/>
-              <w:bottom w:w="100" w:type="dxa"/>
-              <w:left w:w="140" w:type="dxa"/>
-              <w:right w:w="140" w:type="dxa"/>
+              <w:top w:w="80" w:type="dxa"/>
+              <w:bottom w:w="80" w:type="dxa"/>
+              <w:left w:w="100" w:type="dxa"/>
+              <w:right w:w="100" w:type="dxa"/>
             </w:tcMar>
           </w:tcPr>
           <w:p>
@@ -827,7 +1136,7 @@
               <w:rPr>
                 <w:sz w:val="19"/>
               </w:rPr>
-              <w:t>Tương ứng struct/databaseGlobal.dart trong Cashew. Cung cấp thể hiện duy nhất 'late AppDatabase database;' (Singleton Pattern) truy cập an toàn trên toàn ứng dụng.</w:t>
+              <w:t>Tương ứng struct/databaseGlobal.dart. Khai báo biến 'late AppDatabase database;' (Singleton Pattern) cho phép truy cập thể hiện CSDL an toàn từ mọi màn hình.</w:t>
             </w:r>
           </w:p>
         </w:tc>
@@ -835,13 +1144,13 @@
       <w:tr>
         <w:tc>
           <w:tcPr>
-            <w:tcW w:type="dxa" w:w="3216"/>
-            <w:shd w:fill="F8FAFC"/>
+            <w:tcW w:type="dxa" w:w="2160"/>
+            <w:shd w:fill="FFFFFF"/>
             <w:tcMar>
-              <w:top w:w="100" w:type="dxa"/>
-              <w:bottom w:w="100" w:type="dxa"/>
-              <w:left w:w="140" w:type="dxa"/>
-              <w:right w:w="140" w:type="dxa"/>
+              <w:top w:w="80" w:type="dxa"/>
+              <w:bottom w:w="80" w:type="dxa"/>
+              <w:left w:w="100" w:type="dxa"/>
+              <w:right w:w="100" w:type="dxa"/>
             </w:tcMar>
           </w:tcPr>
           <w:p>
@@ -850,19 +1159,21 @@
                 <w:b/>
                 <w:sz w:val="19"/>
               </w:rPr>
-              <w:t>Struct Layer (Models)</w:t>
+              <w:t>Tầng Struct</w:t>
+              <w:br/>
+              <w:t>(Models &amp; Entities)</w:t>
             </w:r>
           </w:p>
         </w:tc>
         <w:tc>
           <w:tcPr>
-            <w:tcW w:type="dxa" w:w="3216"/>
-            <w:shd w:fill="F8FAFC"/>
+            <w:tcW w:type="dxa" w:w="3600"/>
+            <w:shd w:fill="FFFFFF"/>
             <w:tcMar>
-              <w:top w:w="100" w:type="dxa"/>
-              <w:bottom w:w="100" w:type="dxa"/>
-              <w:left w:w="140" w:type="dxa"/>
-              <w:right w:w="140" w:type="dxa"/>
+              <w:top w:w="80" w:type="dxa"/>
+              <w:bottom w:w="80" w:type="dxa"/>
+              <w:left w:w="100" w:type="dxa"/>
+              <w:right w:w="100" w:type="dxa"/>
             </w:tcMar>
           </w:tcPr>
           <w:p>
@@ -876,13 +1187,13 @@
         </w:tc>
         <w:tc>
           <w:tcPr>
-            <w:tcW w:type="dxa" w:w="3216"/>
-            <w:shd w:fill="F8FAFC"/>
+            <w:tcW w:type="dxa" w:w="3888"/>
+            <w:shd w:fill="FFFFFF"/>
             <w:tcMar>
-              <w:top w:w="100" w:type="dxa"/>
-              <w:bottom w:w="100" w:type="dxa"/>
-              <w:left w:w="140" w:type="dxa"/>
-              <w:right w:w="140" w:type="dxa"/>
+              <w:top w:w="80" w:type="dxa"/>
+              <w:bottom w:w="80" w:type="dxa"/>
+              <w:left w:w="100" w:type="dxa"/>
+              <w:right w:w="100" w:type="dxa"/>
             </w:tcMar>
           </w:tcPr>
           <w:p>
@@ -898,13 +1209,13 @@
       <w:tr>
         <w:tc>
           <w:tcPr>
-            <w:tcW w:type="dxa" w:w="3216"/>
+            <w:tcW w:type="dxa" w:w="2160"/>
             <w:shd w:fill="FFFFFF"/>
             <w:tcMar>
-              <w:top w:w="100" w:type="dxa"/>
-              <w:bottom w:w="100" w:type="dxa"/>
-              <w:left w:w="140" w:type="dxa"/>
-              <w:right w:w="140" w:type="dxa"/>
+              <w:top w:w="80" w:type="dxa"/>
+              <w:bottom w:w="80" w:type="dxa"/>
+              <w:left w:w="100" w:type="dxa"/>
+              <w:right w:w="100" w:type="dxa"/>
             </w:tcMar>
           </w:tcPr>
           <w:p>
@@ -913,19 +1224,21 @@
                 <w:b/>
                 <w:sz w:val="19"/>
               </w:rPr>
-              <w:t>Struct Layer (Service)</w:t>
+              <w:t>Tầng Struct</w:t>
+              <w:br/>
+              <w:t>(Service &amp; Logic)</w:t>
             </w:r>
           </w:p>
         </w:tc>
         <w:tc>
           <w:tcPr>
-            <w:tcW w:type="dxa" w:w="3216"/>
+            <w:tcW w:type="dxa" w:w="3600"/>
             <w:shd w:fill="FFFFFF"/>
             <w:tcMar>
-              <w:top w:w="100" w:type="dxa"/>
-              <w:bottom w:w="100" w:type="dxa"/>
-              <w:left w:w="140" w:type="dxa"/>
-              <w:right w:w="140" w:type="dxa"/>
+              <w:top w:w="80" w:type="dxa"/>
+              <w:bottom w:w="80" w:type="dxa"/>
+              <w:left w:w="100" w:type="dxa"/>
+              <w:right w:w="100" w:type="dxa"/>
             </w:tcMar>
           </w:tcPr>
           <w:p>
@@ -941,13 +1254,13 @@
         </w:tc>
         <w:tc>
           <w:tcPr>
-            <w:tcW w:type="dxa" w:w="3216"/>
+            <w:tcW w:type="dxa" w:w="3888"/>
             <w:shd w:fill="FFFFFF"/>
             <w:tcMar>
-              <w:top w:w="100" w:type="dxa"/>
-              <w:bottom w:w="100" w:type="dxa"/>
-              <w:left w:w="140" w:type="dxa"/>
-              <w:right w:w="140" w:type="dxa"/>
+              <w:top w:w="80" w:type="dxa"/>
+              <w:bottom w:w="80" w:type="dxa"/>
+              <w:left w:w="100" w:type="dxa"/>
+              <w:right w:w="100" w:type="dxa"/>
             </w:tcMar>
           </w:tcPr>
           <w:p>
@@ -955,7 +1268,7 @@
               <w:rPr>
                 <w:sz w:val="19"/>
               </w:rPr>
-              <w:t>Tương ứng struct/settings.dart &amp; business logic trong Cashew. Tách biệt quy tắc nghiệp vụ: Xác thực hợp lệ, tính toán thống kê số liệu học tập, quản lý Dark/Light Theme.</w:t>
+              <w:t>Tương ứng struct/settings.dart. Tách biệt quy tắc nghiệp vụ: Xác thực dữ liệu đầu vào, thuật toán DocumentStats, quản lý chế độ xem và cấu hình ứng dụng.</w:t>
             </w:r>
           </w:p>
         </w:tc>
@@ -963,13 +1276,13 @@
       <w:tr>
         <w:tc>
           <w:tcPr>
-            <w:tcW w:type="dxa" w:w="3216"/>
-            <w:shd w:fill="F8FAFC"/>
+            <w:tcW w:type="dxa" w:w="2160"/>
+            <w:shd w:fill="FFFFFF"/>
             <w:tcMar>
-              <w:top w:w="100" w:type="dxa"/>
-              <w:bottom w:w="100" w:type="dxa"/>
-              <w:left w:w="140" w:type="dxa"/>
-              <w:right w:w="140" w:type="dxa"/>
+              <w:top w:w="80" w:type="dxa"/>
+              <w:bottom w:w="80" w:type="dxa"/>
+              <w:left w:w="100" w:type="dxa"/>
+              <w:right w:w="100" w:type="dxa"/>
             </w:tcMar>
           </w:tcPr>
           <w:p>
@@ -978,19 +1291,21 @@
                 <w:b/>
                 <w:sz w:val="19"/>
               </w:rPr>
-              <w:t>Pages Layer</w:t>
+              <w:t>Tầng Pages</w:t>
+              <w:br/>
+              <w:t>(View Layer)</w:t>
             </w:r>
           </w:p>
         </w:tc>
         <w:tc>
           <w:tcPr>
-            <w:tcW w:type="dxa" w:w="3216"/>
-            <w:shd w:fill="F8FAFC"/>
+            <w:tcW w:type="dxa" w:w="3600"/>
+            <w:shd w:fill="FFFFFF"/>
             <w:tcMar>
-              <w:top w:w="100" w:type="dxa"/>
-              <w:bottom w:w="100" w:type="dxa"/>
-              <w:left w:w="140" w:type="dxa"/>
-              <w:right w:w="140" w:type="dxa"/>
+              <w:top w:w="80" w:type="dxa"/>
+              <w:bottom w:w="80" w:type="dxa"/>
+              <w:left w:w="100" w:type="dxa"/>
+              <w:right w:w="100" w:type="dxa"/>
             </w:tcMar>
           </w:tcPr>
           <w:p>
@@ -1010,13 +1325,13 @@
         </w:tc>
         <w:tc>
           <w:tcPr>
-            <w:tcW w:type="dxa" w:w="3216"/>
-            <w:shd w:fill="F8FAFC"/>
+            <w:tcW w:type="dxa" w:w="3888"/>
+            <w:shd w:fill="FFFFFF"/>
             <w:tcMar>
-              <w:top w:w="100" w:type="dxa"/>
-              <w:bottom w:w="100" w:type="dxa"/>
-              <w:left w:w="140" w:type="dxa"/>
-              <w:right w:w="140" w:type="dxa"/>
+              <w:top w:w="80" w:type="dxa"/>
+              <w:bottom w:w="80" w:type="dxa"/>
+              <w:left w:w="100" w:type="dxa"/>
+              <w:right w:w="100" w:type="dxa"/>
             </w:tcMar>
           </w:tcPr>
           <w:p>
@@ -1024,7 +1339,7 @@
               <w:rPr>
                 <w:sz w:val="19"/>
               </w:rPr>
-              <w:t>Tương ứng thư mục pages/ trong Cashew. Chứa các màn hình giao diện người dùng độc lập, giao tiếp với CSDL thông qua tầng struct/.</w:t>
+              <w:t>Tương ứng thư mục pages/ trong Cashew. Chứa các màn hình độc lập, giao tiếp với CSDL hoàn toàn thông qua tầng struct/ và databaseGlobal.</w:t>
             </w:r>
           </w:p>
         </w:tc>
@@ -1032,13 +1347,13 @@
       <w:tr>
         <w:tc>
           <w:tcPr>
-            <w:tcW w:type="dxa" w:w="3216"/>
+            <w:tcW w:type="dxa" w:w="2160"/>
             <w:shd w:fill="FFFFFF"/>
             <w:tcMar>
-              <w:top w:w="100" w:type="dxa"/>
-              <w:bottom w:w="100" w:type="dxa"/>
-              <w:left w:w="140" w:type="dxa"/>
-              <w:right w:w="140" w:type="dxa"/>
+              <w:top w:w="80" w:type="dxa"/>
+              <w:bottom w:w="80" w:type="dxa"/>
+              <w:left w:w="100" w:type="dxa"/>
+              <w:right w:w="100" w:type="dxa"/>
             </w:tcMar>
           </w:tcPr>
           <w:p>
@@ -1047,19 +1362,21 @@
                 <w:b/>
                 <w:sz w:val="19"/>
               </w:rPr>
-              <w:t>Widgets Layer</w:t>
+              <w:t>Tầng Widgets</w:t>
+              <w:br/>
+              <w:t>(Component Layer)</w:t>
             </w:r>
           </w:p>
         </w:tc>
         <w:tc>
           <w:tcPr>
-            <w:tcW w:type="dxa" w:w="3216"/>
+            <w:tcW w:type="dxa" w:w="3600"/>
             <w:shd w:fill="FFFFFF"/>
             <w:tcMar>
-              <w:top w:w="100" w:type="dxa"/>
-              <w:bottom w:w="100" w:type="dxa"/>
-              <w:left w:w="140" w:type="dxa"/>
-              <w:right w:w="140" w:type="dxa"/>
+              <w:top w:w="80" w:type="dxa"/>
+              <w:bottom w:w="80" w:type="dxa"/>
+              <w:left w:w="100" w:type="dxa"/>
+              <w:right w:w="100" w:type="dxa"/>
             </w:tcMar>
           </w:tcPr>
           <w:p>
@@ -1079,13 +1396,13 @@
         </w:tc>
         <w:tc>
           <w:tcPr>
-            <w:tcW w:type="dxa" w:w="3216"/>
+            <w:tcW w:type="dxa" w:w="3888"/>
             <w:shd w:fill="FFFFFF"/>
             <w:tcMar>
-              <w:top w:w="100" w:type="dxa"/>
-              <w:bottom w:w="100" w:type="dxa"/>
-              <w:left w:w="140" w:type="dxa"/>
-              <w:right w:w="140" w:type="dxa"/>
+              <w:top w:w="80" w:type="dxa"/>
+              <w:bottom w:w="80" w:type="dxa"/>
+              <w:left w:w="100" w:type="dxa"/>
+              <w:right w:w="100" w:type="dxa"/>
             </w:tcMar>
           </w:tcPr>
           <w:p>
@@ -1093,7 +1410,7 @@
               <w:rPr>
                 <w:sz w:val="19"/>
               </w:rPr>
-              <w:t>Tương ứng thư mục widgets/ trong Cashew. Chứa các thành phần UI nhỏ có khả năng tái sử dụng cao, phân tách rõ giữa hiển thị và trạng thái.</w:t>
+              <w:t>Tương ứng thư mục widgets/ trong Cashew. Chứa các thành phần giao diện nhỏ, có tính tái sử dụng cao, không gắn chặt logic lưu trữ.</w:t>
             </w:r>
           </w:p>
         </w:tc>
@@ -1101,88 +1418,209 @@
     </w:tbl>
     <w:p>
       <w:pPr>
-        <w:spacing w:after="320"/>
+        <w:spacing w:after="240"/>
+      </w:pPr>
+    </w:p>
+    <w:tbl>
+      <w:tblPr>
+        <w:tblW w:type="auto" w:w="0"/>
+        <w:jc w:val="center"/>
+        <w:tblLook w:firstColumn="1" w:firstRow="1" w:lastColumn="0" w:lastRow="0" w:noHBand="0" w:noVBand="1" w:val="04A0"/>
+      </w:tblPr>
+      <w:tblGrid>
+        <w:gridCol w:w="9360"/>
+      </w:tblGrid>
+      <w:tr>
+        <w:tc>
+          <w:tcPr>
+            <w:tcW w:type="dxa" w:w="9360"/>
+            <w:shd w:fill="F8FAFC"/>
+            <w:tcMar>
+              <w:top w:w="120" w:type="dxa"/>
+              <w:bottom w:w="120" w:type="dxa"/>
+              <w:left w:w="160" w:type="dxa"/>
+              <w:right w:w="160" w:type="dxa"/>
+            </w:tcMar>
+            <w:tcBorders>
+              <w:left w:val="single" w:sz="18" w:space="0" w:color="94A3B8"/>
+              <w:top w:val="none"/>
+              <w:bottom w:val="none"/>
+              <w:right w:val="none"/>
+            </w:tcBorders>
+          </w:tcPr>
+          <w:p>
+            <w:pPr>
+              <w:spacing w:before="40" w:after="40"/>
+            </w:pPr>
+            <w:r>
+              <w:rPr>
+                <w:rFonts w:ascii="Calibri" w:hAnsi="Calibri"/>
+                <w:b/>
+                <w:color w:val="334155"/>
+                <w:sz w:val="20"/>
+              </w:rPr>
+              <w:t xml:space="preserve">Nguyên tắc phân tầng: </w:t>
+            </w:r>
+            <w:r>
+              <w:rPr>
+                <w:rFonts w:ascii="Calibri" w:hAnsi="Calibri"/>
+                <w:color w:val="475569"/>
+                <w:sz w:val="20"/>
+              </w:rPr>
+              <w:t>Nguyên tắc kiến trúc cốt lõi: Tầng UI (Pages/Widgets) không bao giờ trực tiếp tạo hoặc thực thi câu lệnh SQL raw query. Mọi thao tác truy xuất hoặc cập nhật bắt buộc phải đi qua DocumentService hoặc AppDatabase. Điều này giúp mã nguồn có tính mô-đun cao, dễ dàng thay thế tầng lưu trữ mà không ảnh hưởng đến giao diện người dùng.</w:t>
+            </w:r>
+          </w:p>
+        </w:tc>
+      </w:tr>
+    </w:tbl>
+    <w:p>
+      <w:pPr>
+        <w:spacing w:after="80"/>
       </w:pPr>
     </w:p>
     <w:p>
       <w:pPr>
-        <w:spacing w:before="320" w:after="160"/>
+        <w:keepNext/>
+        <w:spacing w:before="320" w:after="120"/>
       </w:pPr>
       <w:r>
         <w:rPr>
+          <w:rFonts w:ascii="Calibri" w:hAnsi="Calibri"/>
           <w:b/>
-          <w:color w:val="1E3A8A"/>
-          <w:sz w:val="28"/>
+          <w:color w:val="0F172A"/>
+          <w:sz w:val="27"/>
         </w:rPr>
-        <w:t>CHI TIẾT CHECKLIST 3: TRIỂN KHAI CÁC CHỨC NĂNG CỐT LÕI (CRUD &amp; SEARCH)</w:t>
+        <w:t>MỤC III: TRIỂN KHAI CÁC CHỨC NĂNG CỐT LÕI (CHECKLIST 3)</w:t>
+      </w:r>
+    </w:p>
+    <w:p>
+      <w:pPr>
+        <w:keepNext/>
+        <w:spacing w:before="240" w:after="80"/>
+      </w:pPr>
+      <w:r>
+        <w:rPr>
+          <w:rFonts w:ascii="Calibri" w:hAnsi="Calibri"/>
+          <w:b/>
+          <w:color w:val="1E293B"/>
+          <w:sz w:val="23"/>
+        </w:rPr>
+        <w:t>3.1. Các chức năng nghiệp vụ CRUD</w:t>
       </w:r>
     </w:p>
     <w:p>
       <w:r>
-        <w:t>Tất cả các chức năng theo yêu cầu đề bài đã được hoàn thành đầy đủ, mượt mà và trực quan:</w:t>
+        <w:t>1. Thêm mới tài liệu (Create): Màn hình AddEditDocumentPage cho phép người dùng nhập đầy đủ các trường thông tin: Tiêu đề (bắt buộc), Chọn môn học từ danh sách, Chọn loại tài liệu, Ngày giờ hạn nộp (DatePicker &amp; TimePicker), Đường dẫn tệp hoặc liên kết URL, Định dạng tệp và Dung lượng, Ghi chú vắn tắt. Form được kiểm tra validation trước khi lưu.</w:t>
       </w:r>
     </w:p>
     <w:p>
       <w:r>
-        <w:t>1. Chức năng Thêm Tài liệu (Create): Màn hình AddEditDocumentPage cung cấp form nhập liệu đầy đủ gồm Tiêu đề (bắt buộc), Môn học (Dropdown tải từ DB), Phân loại (ChoiceChip), Hạn nộp bài tập (kèm DatePicker &amp; TimePicker), Đường dẫn tệp/liên kết, Định dạng tệp (PDF, DOCX, ZIP...), Dung lượng và Ghi chú nội dung. Nút chuyển đổi Đánh dấu Quan trọng (Yêu thích).</w:t>
+        <w:t>2. Chỉnh sửa tài liệu (Update): Cho phép sửa đổi thông tin của tài liệu đã có. Hỗ trợ thao tác nhanh chuyển đổi trạng thái hoàn thành bài tập (toggle completed) ngay tại menu thẻ hoặc màn hình chi tiết.</w:t>
       </w:r>
     </w:p>
     <w:p>
       <w:r>
-        <w:t>2. Chức năng Chỉnh sửa Tài liệu (Update): Cho phép sửa mọi thông tin tài liệu. Tại màn hình DocumentDetailPage hoặc menu thao tác nhanh trên DocumentCard, người dùng có thể đổi trạng thái bài tập giữa 'Đã nộp bài' và 'Chưa nộp' chỉ với 1 chạm.</w:t>
+        <w:t>3. Xóa tài liệu (Delete): Tích hợp hộp thoại xác nhận AppFunctions.showConfirmDialog trước khi thực hiện xóa. Hỗ trợ xóa lan truyền khi xóa môn học tại SubjectsManagementPage.</w:t>
       </w:r>
     </w:p>
     <w:p>
       <w:r>
-        <w:t>3. Chức năng Xóa Tài liệu (Delete): Tích hợp hộp thoại xác nhận AppFunctions.showConfirmDialog trước khi xóa để ngăn ngừa thao tác nhầm lẫn. Khi xóa một Môn học trong SubjectsManagementPage, toàn bộ tài liệu thuộc môn học đó tự động bị xóa theo (Cascade).</w:t>
+        <w:t>4. Quản lý Môn học (Subjects Management): Màn hình chuyên biệt cho phép thêm môn học mới với mã màu sắc nhận diện tự chọn hoặc xóa môn học hiện hữu.</w:t>
+      </w:r>
+    </w:p>
+    <w:p>
+      <w:pPr>
+        <w:keepNext/>
+        <w:spacing w:before="240" w:after="80"/>
+      </w:pPr>
+      <w:r>
+        <w:rPr>
+          <w:rFonts w:ascii="Calibri" w:hAnsi="Calibri"/>
+          <w:b/>
+          <w:color w:val="1E293B"/>
+          <w:sz w:val="23"/>
+        </w:rPr>
+        <w:t>3.2. Chức năng Tìm kiếm và Lọc dữ liệu</w:t>
       </w:r>
     </w:p>
     <w:p>
       <w:r>
-        <w:t>4. Chức năng Tìm kiếm &amp; Lọc Đa tiêu chí (Search &amp; Filter):</w:t>
+        <w:t>• Tìm kiếm từ khóa: Thanh tìm kiếm SearchFilterBar cập nhật danh sách tức thời khi người dùng nhập ký tự. Câu lệnh truy vấn SQL sử dụng mệnh đề: (title LIKE '%query%' OR note LIKE '%query%').</w:t>
       </w:r>
     </w:p>
     <w:p>
       <w:r>
-        <w:t xml:space="preserve">   • Thanh tìm kiếm SearchFilterBar lọc kết quả tức thời khi người dùng gõ từ khóa (tìm kiếm cả trong tiêu đề và ghi chú).</w:t>
-        <w:br/>
-        <w:t xml:space="preserve">   • Dải Chip phân loại: Lọc nhanh Tất cả, Bài giảng, Bài tập, Tham khảo, Đề thi.</w:t>
-        <w:br/>
-        <w:t xml:space="preserve">   • Dải Môn học trượt ngang: Lọc danh sách theo từng môn học cụ thể.</w:t>
-        <w:br/>
-        <w:t xml:space="preserve">   • Khối Thống kê StatSummaryCards: Chạm vào thẻ 'Bài tập chờ' để lọc các bài tập chưa làm; chạm vào 'Quan trọng' để lọc các tài liệu có gắn sao.</w:t>
+        <w:t>• Lọc theo Môn học: Trình đơn lựa chọn môn học tích hợp trên thanh công cụ cho phép lọc danh sách theo môn học cụ thể hoặc hiển thị tất cả môn.</w:t>
       </w:r>
     </w:p>
     <w:p>
       <w:r>
-        <w:t>5. Thiết kế Material Design 3 Trang nhã (AI Design Principles):</w:t>
+        <w:t>• Lọc theo Loại tài liệu: Dải nút lọc ngang cho phép chuyển đổi nhanh giữa: Tất cả, Bài giảng, Bài tập, Tham khảo, Đề thi.</w:t>
       </w:r>
     </w:p>
     <w:p>
       <w:r>
-        <w:t xml:space="preserve">   • Bảng màu Slate Indigo học thuật (#1E3A8A / #2563EB) kết hợp bề mặt xám trung tính ấm (#F8FAFC light / #0F172A dark), tạo cảm giác tập trung và chuyên nghiệp.</w:t>
-        <w:br/>
-        <w:t xml:space="preserve">   • Huy hiệu phân loại dạng Tonal Pill Badge nhẹ nhàng, độ tương phản cao, tuyệt đối không lạm dụng dải gradient loè loẹt gây mỏi mắt.</w:t>
-        <w:br/>
-        <w:t xml:space="preserve">   • Hỗ trợ 2 chế độ hiển thị danh sách: Thẻ chi tiết (Standard Card) và Dòng thu gọn (Compact View), chuyển đổi linh hoạt bằng nút trên AppBar.</w:t>
+        <w:t>• Lọc trạng thái: Thanh chỉ số StatSummaryCards cho phép nhấn vào 'Bài tập chờ' để lọc các bài tập chưa hoàn thành, hoặc 'Quan trọng' để lọc các tài liệu có đánh dấu sao.</w:t>
       </w:r>
     </w:p>
     <w:p>
       <w:pPr>
-        <w:spacing w:before="320" w:after="160"/>
+        <w:keepNext/>
+        <w:spacing w:before="240" w:after="80"/>
       </w:pPr>
       <w:r>
         <w:rPr>
+          <w:rFonts w:ascii="Calibri" w:hAnsi="Calibri"/>
           <w:b/>
-          <w:color w:val="1E3A8A"/>
-          <w:sz w:val="28"/>
+          <w:color w:val="1E293B"/>
+          <w:sz w:val="23"/>
         </w:rPr>
-        <w:t>CHI TIẾT CHECKLIST 4: KIỂM THỬ TỰ ĐỘNG &amp; TÍNH ĐÚNG ĐẮN CỦA KIẾN TRÚC</w:t>
+        <w:t>3.3. Tối ưu hóa Giao diện Người dùng (UI/UX) theo chuẩn Material Design 3</w:t>
       </w:r>
     </w:p>
     <w:p>
       <w:r>
-        <w:t>Để chứng minh tính đúng đắn và độc lập giữa các tầng xử lý (Database, Struct/Nghiệp vụ, UI), sinh viên đã viết 12 test case tự động thuộc 3 bộ kiểm thử riêng biệt:</w:t>
+        <w:t>Để khắc phục hiện tượng giao diện bị rối mắt và đảm bảo tính đơn giản, thanh lịch của ứng dụng di động, hệ thống giao diện đã được tái thiết kế theo các nguyên tắc chuẩn:</w:t>
+      </w:r>
+    </w:p>
+    <w:p>
+      <w:r>
+        <w:t>• Tinh gọn khu vực đầu trang (Header Area): Thay vì xếp chồng nhiều dải thẻ và thanh cuộn ngang gây chiếm dụng không gian, giao diện tích hợp thanh tìm kiếm và dải lọc môn học/loại tài liệu vào một hàng duy nhất.</w:t>
+      </w:r>
+    </w:p>
+    <w:p>
+      <w:r>
+        <w:t>• Thanh chỉ số (Metric Segmented Bar): Chuyển đổi khối thẻ thống kê cồng kềnh thành một thanh chỉ số 3 phân đoạn phẳng (Tài liệu, Bài tập chờ, Quan trọng) với chiều cao chỉ 52dp, vừa hiển thị số liệu vừa đóng vai trò nút lọc tương tác nhanh.</w:t>
+      </w:r>
+    </w:p>
+    <w:p>
+      <w:r>
+        <w:t>• Thẻ tài liệu tinh giản (Minimalist Document Card): Thẻ hiển thị DocumentCard tập trung vào tiêu đề và thông tin môn học, chuyển các thao tác phụ (sửa, đổi trạng thái, xóa) vào menu ngữ cảnh 3 chấm (PopupMenuButton). Điều này loại bỏ các nút bấm thừa trên mặt thẻ, nâng cao độ thông thoáng và khả năng đọc.</w:t>
+      </w:r>
+    </w:p>
+    <w:p>
+      <w:r>
+        <w:t>• Hệ thống màu sắc nhã nhặn: Sử dụng bảng màu Slate Indigo với màu nền sáng dịu (#F8FAFC) và các huy hiệu phân loại dạng Tonal Pill nhẹ nhàng, tránh lạm dụng màu sắc sặc sỡ.</w:t>
+      </w:r>
+    </w:p>
+    <w:p>
+      <w:pPr>
+        <w:keepNext/>
+        <w:spacing w:before="320" w:after="120"/>
+      </w:pPr>
+      <w:r>
+        <w:rPr>
+          <w:rFonts w:ascii="Calibri" w:hAnsi="Calibri"/>
+          <w:b/>
+          <w:color w:val="0F172A"/>
+          <w:sz w:val="27"/>
+        </w:rPr>
+        <w:t>MỤC IV: KIỂM THỬ TÍNH ĐÚNG ĐẮN CỦA VIỆC PHÂN TÁCH LỚP (CHECKLIST 4)</w:t>
+      </w:r>
+    </w:p>
+    <w:p>
+      <w:r>
+        <w:t>Để kiểm chứng tính độc lập và đúng đắn giữa các tầng trong kiến trúc Cashew, hệ thống đã được kiểm thử tự động toàn diện qua 3 bộ test tương ứng với 3 tầng xử lý:</w:t>
       </w:r>
     </w:p>
     <w:tbl>
@@ -1191,83 +1629,109 @@
         <w:jc w:val="center"/>
         <w:tblLook w:firstColumn="1" w:firstRow="1" w:lastColumn="0" w:lastRow="0" w:noHBand="0" w:noVBand="1" w:val="04A0"/>
         <w:tblBorders>
-          <w:top w:val="single" w:sz="4" w:space="0" w:color="CBD5E1"/>
-          <w:bottom w:val="single" w:sz="4" w:space="0" w:color="CBD5E1"/>
+          <w:top w:val="single" w:sz="4" w:space="0" w:color="D1D5DB"/>
+          <w:bottom w:val="single" w:sz="4" w:space="0" w:color="D1D5DB"/>
           <w:left w:val="none"/>
           <w:right w:val="none"/>
-          <w:insideH w:val="single" w:sz="4" w:space="0" w:color="CBD5E1"/>
+          <w:insideH w:val="single" w:sz="4" w:space="0" w:color="D1D5DB"/>
           <w:insideV w:val="none"/>
         </w:tblBorders>
       </w:tblPr>
       <w:tblGrid>
-        <w:gridCol w:w="3216"/>
-        <w:gridCol w:w="3216"/>
-        <w:gridCol w:w="3216"/>
+        <w:gridCol w:w="2340"/>
+        <w:gridCol w:w="2340"/>
+        <w:gridCol w:w="2340"/>
+        <w:gridCol w:w="2340"/>
       </w:tblGrid>
       <w:tr>
         <w:tc>
           <w:tcPr>
-            <w:tcW w:type="dxa" w:w="3216"/>
-            <w:shd w:fill="1E3A8A"/>
+            <w:tcW w:type="dxa" w:w="2160"/>
+            <w:shd w:fill="F1F5F9"/>
             <w:tcMar>
-              <w:top w:w="120" w:type="dxa"/>
-              <w:bottom w:w="120" w:type="dxa"/>
-              <w:left w:w="140" w:type="dxa"/>
-              <w:right w:w="140" w:type="dxa"/>
+              <w:top w:w="100" w:type="dxa"/>
+              <w:bottom w:w="100" w:type="dxa"/>
+              <w:left w:w="100" w:type="dxa"/>
+              <w:right w:w="100" w:type="dxa"/>
             </w:tcMar>
           </w:tcPr>
           <w:p>
             <w:r>
               <w:rPr>
                 <w:b/>
-                <w:color w:val="FFFFFF"/>
-                <w:sz w:val="20"/>
+                <w:color w:val="0F172A"/>
+                <w:sz w:val="19"/>
               </w:rPr>
-              <w:t>Bộ kiểm thử</w:t>
+              <w:t>Tầng kiểm thử</w:t>
             </w:r>
           </w:p>
         </w:tc>
         <w:tc>
           <w:tcPr>
-            <w:tcW w:type="dxa" w:w="3216"/>
-            <w:shd w:fill="1E3A8A"/>
+            <w:tcW w:type="dxa" w:w="2880"/>
+            <w:shd w:fill="F1F5F9"/>
             <w:tcMar>
-              <w:top w:w="120" w:type="dxa"/>
-              <w:bottom w:w="120" w:type="dxa"/>
-              <w:left w:w="140" w:type="dxa"/>
-              <w:right w:w="140" w:type="dxa"/>
+              <w:top w:w="100" w:type="dxa"/>
+              <w:bottom w:w="100" w:type="dxa"/>
+              <w:left w:w="100" w:type="dxa"/>
+              <w:right w:w="100" w:type="dxa"/>
             </w:tcMar>
           </w:tcPr>
           <w:p>
             <w:r>
               <w:rPr>
                 <w:b/>
-                <w:color w:val="FFFFFF"/>
-                <w:sz w:val="20"/>
+                <w:color w:val="0F172A"/>
+                <w:sz w:val="19"/>
               </w:rPr>
-              <w:t>Mục tiêu &amp; Nội dung kiểm thử</w:t>
+              <w:t>Tệp mã nguồn kiểm thử</w:t>
             </w:r>
           </w:p>
         </w:tc>
         <w:tc>
           <w:tcPr>
-            <w:tcW w:type="dxa" w:w="3216"/>
-            <w:shd w:fill="1E3A8A"/>
+            <w:tcW w:type="dxa" w:w="3744"/>
+            <w:shd w:fill="F1F5F9"/>
             <w:tcMar>
-              <w:top w:w="120" w:type="dxa"/>
-              <w:bottom w:w="120" w:type="dxa"/>
-              <w:left w:w="140" w:type="dxa"/>
-              <w:right w:w="140" w:type="dxa"/>
+              <w:top w:w="100" w:type="dxa"/>
+              <w:bottom w:w="100" w:type="dxa"/>
+              <w:left w:w="100" w:type="dxa"/>
+              <w:right w:w="100" w:type="dxa"/>
             </w:tcMar>
           </w:tcPr>
           <w:p>
             <w:r>
               <w:rPr>
                 <w:b/>
-                <w:color w:val="FFFFFF"/>
-                <w:sz w:val="20"/>
+                <w:color w:val="0F172A"/>
+                <w:sz w:val="19"/>
               </w:rPr>
-              <w:t>Kết quả thực thi</w:t>
+              <w:t>Nội dung và phạm vi kiểm tra</w:t>
+            </w:r>
+          </w:p>
+        </w:tc>
+        <w:tc>
+          <w:tcPr>
+            <w:tcW w:type="dxa" w:w="1296"/>
+            <w:shd w:fill="F1F5F9"/>
+            <w:tcMar>
+              <w:top w:w="100" w:type="dxa"/>
+              <w:bottom w:w="100" w:type="dxa"/>
+              <w:left w:w="100" w:type="dxa"/>
+              <w:right w:w="100" w:type="dxa"/>
+            </w:tcMar>
+          </w:tcPr>
+          <w:p>
+            <w:pPr>
+              <w:jc w:val="center"/>
+            </w:pPr>
+            <w:r>
+              <w:rPr>
+                <w:b/>
+                <w:color w:val="0F172A"/>
+                <w:sz w:val="19"/>
+              </w:rPr>
+              <w:t>Kết quả</w:t>
             </w:r>
           </w:p>
         </w:tc>
@@ -1275,13 +1739,13 @@
       <w:tr>
         <w:tc>
           <w:tcPr>
-            <w:tcW w:type="dxa" w:w="3216"/>
-            <w:shd w:fill="F8FAFC"/>
+            <w:tcW w:type="dxa" w:w="2160"/>
+            <w:shd w:fill="FFFFFF"/>
             <w:tcMar>
-              <w:top w:w="100" w:type="dxa"/>
-              <w:bottom w:w="100" w:type="dxa"/>
-              <w:left w:w="140" w:type="dxa"/>
-              <w:right w:w="140" w:type="dxa"/>
+              <w:top w:w="80" w:type="dxa"/>
+              <w:bottom w:w="80" w:type="dxa"/>
+              <w:left w:w="100" w:type="dxa"/>
+              <w:right w:w="100" w:type="dxa"/>
             </w:tcMar>
           </w:tcPr>
           <w:p>
@@ -1290,21 +1754,21 @@
                 <w:b/>
                 <w:sz w:val="19"/>
               </w:rPr>
-              <w:t>test/database_test.dart</w:t>
+              <w:t>Tầng Database</w:t>
               <w:br/>
-              <w:t>(Tầng Database)</w:t>
+              <w:t>(Data Layer)</w:t>
             </w:r>
           </w:p>
         </w:tc>
         <w:tc>
           <w:tcPr>
-            <w:tcW w:type="dxa" w:w="3216"/>
-            <w:shd w:fill="F8FAFC"/>
+            <w:tcW w:type="dxa" w:w="2880"/>
+            <w:shd w:fill="FFFFFF"/>
             <w:tcMar>
-              <w:top w:w="100" w:type="dxa"/>
-              <w:bottom w:w="100" w:type="dxa"/>
-              <w:left w:w="140" w:type="dxa"/>
-              <w:right w:w="140" w:type="dxa"/>
+              <w:top w:w="80" w:type="dxa"/>
+              <w:bottom w:w="80" w:type="dxa"/>
+              <w:left w:w="100" w:type="dxa"/>
+              <w:right w:w="100" w:type="dxa"/>
             </w:tcMar>
           </w:tcPr>
           <w:p>
@@ -1312,31 +1776,51 @@
               <w:rPr>
                 <w:sz w:val="19"/>
               </w:rPr>
-              <w:t>Kiểm thử 6 ca: Khởi tạo DB in-memory SQLite, nạp seed data, Thêm bản ghi mới, Cập nhật bản ghi, Toggle yêu thích/hoàn thành, Xóa bản ghi, Truy vấn WHERE LIKE &amp; Type, Ràng buộc xóa cascading môn học.</w:t>
+              <w:t>test/database_test.dart</w:t>
             </w:r>
           </w:p>
         </w:tc>
         <w:tc>
           <w:tcPr>
-            <w:tcW w:type="dxa" w:w="3216"/>
-            <w:shd w:fill="F8FAFC"/>
+            <w:tcW w:type="dxa" w:w="3744"/>
+            <w:shd w:fill="FFFFFF"/>
             <w:tcMar>
-              <w:top w:w="100" w:type="dxa"/>
-              <w:bottom w:w="100" w:type="dxa"/>
-              <w:left w:w="140" w:type="dxa"/>
-              <w:right w:w="140" w:type="dxa"/>
+              <w:top w:w="80" w:type="dxa"/>
+              <w:bottom w:w="80" w:type="dxa"/>
+              <w:left w:w="100" w:type="dxa"/>
+              <w:right w:w="100" w:type="dxa"/>
             </w:tcMar>
           </w:tcPr>
           <w:p>
             <w:r>
               <w:rPr>
-                <w:b/>
-                <w:color w:val="0F766E"/>
                 <w:sz w:val="19"/>
               </w:rPr>
-              <w:t>PASSED 6/6</w:t>
-              <w:br/>
-              <w:t>(100% Thành công)</w:t>
+              <w:t>6 test cases: Khởi tạo CSDL in-memory SQLite, nạp seed data, thực thi CRUD, truy vấn WHERE LIKE, kiểm tra ràng buộc xóa lan truyền (cascade delete).</w:t>
+            </w:r>
+          </w:p>
+        </w:tc>
+        <w:tc>
+          <w:tcPr>
+            <w:tcW w:type="dxa" w:w="1296"/>
+            <w:shd w:fill="FFFFFF"/>
+            <w:tcMar>
+              <w:top w:w="80" w:type="dxa"/>
+              <w:bottom w:w="80" w:type="dxa"/>
+              <w:left w:w="100" w:type="dxa"/>
+              <w:right w:w="100" w:type="dxa"/>
+            </w:tcMar>
+          </w:tcPr>
+          <w:p>
+            <w:pPr>
+              <w:jc w:val="center"/>
+            </w:pPr>
+            <w:r>
+              <w:rPr>
+                <w:b/>
+                <w:sz w:val="19"/>
+              </w:rPr>
+              <w:t>6/6 Pass</w:t>
             </w:r>
           </w:p>
         </w:tc>
@@ -1344,13 +1828,13 @@
       <w:tr>
         <w:tc>
           <w:tcPr>
-            <w:tcW w:type="dxa" w:w="3216"/>
+            <w:tcW w:type="dxa" w:w="2160"/>
             <w:shd w:fill="FFFFFF"/>
             <w:tcMar>
-              <w:top w:w="100" w:type="dxa"/>
-              <w:bottom w:w="100" w:type="dxa"/>
-              <w:left w:w="140" w:type="dxa"/>
-              <w:right w:w="140" w:type="dxa"/>
+              <w:top w:w="80" w:type="dxa"/>
+              <w:bottom w:w="80" w:type="dxa"/>
+              <w:left w:w="100" w:type="dxa"/>
+              <w:right w:w="100" w:type="dxa"/>
             </w:tcMar>
           </w:tcPr>
           <w:p>
@@ -1359,21 +1843,21 @@
                 <w:b/>
                 <w:sz w:val="19"/>
               </w:rPr>
-              <w:t>test/service_test.dart</w:t>
+              <w:t>Tầng Nghiệp vụ</w:t>
               <w:br/>
-              <w:t>(Tầng Nghiệp vụ - Struct)</w:t>
+              <w:t>(Struct Layer)</w:t>
             </w:r>
           </w:p>
         </w:tc>
         <w:tc>
           <w:tcPr>
-            <w:tcW w:type="dxa" w:w="3216"/>
+            <w:tcW w:type="dxa" w:w="2880"/>
             <w:shd w:fill="FFFFFF"/>
             <w:tcMar>
-              <w:top w:w="100" w:type="dxa"/>
-              <w:bottom w:w="100" w:type="dxa"/>
-              <w:left w:w="140" w:type="dxa"/>
-              <w:right w:w="140" w:type="dxa"/>
+              <w:top w:w="80" w:type="dxa"/>
+              <w:bottom w:w="80" w:type="dxa"/>
+              <w:left w:w="100" w:type="dxa"/>
+              <w:right w:w="100" w:type="dxa"/>
             </w:tcMar>
           </w:tcPr>
           <w:p>
@@ -1381,31 +1865,51 @@
               <w:rPr>
                 <w:sz w:val="19"/>
               </w:rPr>
-              <w:t>Kiểm thử 5 ca: Logic xác thực dữ liệu rỗng (Validation), Thuật toán thống kê học tập (DocumentStats), Đếm bài tập quá hạn theo ngày thực tế, Ném lỗi ArgumentError khi sai quy tắc.</w:t>
+              <w:t>test/service_test.dart</w:t>
             </w:r>
           </w:p>
         </w:tc>
         <w:tc>
           <w:tcPr>
-            <w:tcW w:type="dxa" w:w="3216"/>
+            <w:tcW w:type="dxa" w:w="3744"/>
             <w:shd w:fill="FFFFFF"/>
             <w:tcMar>
-              <w:top w:w="100" w:type="dxa"/>
-              <w:bottom w:w="100" w:type="dxa"/>
-              <w:left w:w="140" w:type="dxa"/>
-              <w:right w:w="140" w:type="dxa"/>
+              <w:top w:w="80" w:type="dxa"/>
+              <w:bottom w:w="80" w:type="dxa"/>
+              <w:left w:w="100" w:type="dxa"/>
+              <w:right w:w="100" w:type="dxa"/>
             </w:tcMar>
           </w:tcPr>
           <w:p>
             <w:r>
               <w:rPr>
-                <w:b/>
-                <w:color w:val="0F766E"/>
                 <w:sz w:val="19"/>
               </w:rPr>
-              <w:t>PASSED 5/5</w:t>
-              <w:br/>
-              <w:t>(100% Thành công)</w:t>
+              <w:t>5 test cases: Kiểm tra hàm xác thực dữ liệu đầu vào (Validation), thuật toán tính toán DocumentStats, đếm bài tập quá hạn, ném ngoại lệ ArgumentError khi sai quy tắc.</w:t>
+            </w:r>
+          </w:p>
+        </w:tc>
+        <w:tc>
+          <w:tcPr>
+            <w:tcW w:type="dxa" w:w="1296"/>
+            <w:shd w:fill="FFFFFF"/>
+            <w:tcMar>
+              <w:top w:w="80" w:type="dxa"/>
+              <w:bottom w:w="80" w:type="dxa"/>
+              <w:left w:w="100" w:type="dxa"/>
+              <w:right w:w="100" w:type="dxa"/>
+            </w:tcMar>
+          </w:tcPr>
+          <w:p>
+            <w:pPr>
+              <w:jc w:val="center"/>
+            </w:pPr>
+            <w:r>
+              <w:rPr>
+                <w:b/>
+                <w:sz w:val="19"/>
+              </w:rPr>
+              <w:t>5/5 Pass</w:t>
             </w:r>
           </w:p>
         </w:tc>
@@ -1413,13 +1917,13 @@
       <w:tr>
         <w:tc>
           <w:tcPr>
-            <w:tcW w:type="dxa" w:w="3216"/>
-            <w:shd w:fill="F8FAFC"/>
+            <w:tcW w:type="dxa" w:w="2160"/>
+            <w:shd w:fill="FFFFFF"/>
             <w:tcMar>
-              <w:top w:w="100" w:type="dxa"/>
-              <w:bottom w:w="100" w:type="dxa"/>
-              <w:left w:w="140" w:type="dxa"/>
-              <w:right w:w="140" w:type="dxa"/>
+              <w:top w:w="80" w:type="dxa"/>
+              <w:bottom w:w="80" w:type="dxa"/>
+              <w:left w:w="100" w:type="dxa"/>
+              <w:right w:w="100" w:type="dxa"/>
             </w:tcMar>
           </w:tcPr>
           <w:p>
@@ -1428,21 +1932,21 @@
                 <w:b/>
                 <w:sz w:val="19"/>
               </w:rPr>
-              <w:t>test/widget_test.dart</w:t>
+              <w:t>Tầng Giao diện</w:t>
               <w:br/>
-              <w:t>(Tầng Giao diện - UI)</w:t>
+              <w:t>(UI Layer)</w:t>
             </w:r>
           </w:p>
         </w:tc>
         <w:tc>
           <w:tcPr>
-            <w:tcW w:type="dxa" w:w="3216"/>
-            <w:shd w:fill="F8FAFC"/>
+            <w:tcW w:type="dxa" w:w="2880"/>
+            <w:shd w:fill="FFFFFF"/>
             <w:tcMar>
-              <w:top w:w="100" w:type="dxa"/>
-              <w:bottom w:w="100" w:type="dxa"/>
-              <w:left w:w="140" w:type="dxa"/>
-              <w:right w:w="140" w:type="dxa"/>
+              <w:top w:w="80" w:type="dxa"/>
+              <w:bottom w:w="80" w:type="dxa"/>
+              <w:left w:w="100" w:type="dxa"/>
+              <w:right w:w="100" w:type="dxa"/>
             </w:tcMar>
           </w:tcPr>
           <w:p>
@@ -1450,31 +1954,51 @@
               <w:rPr>
                 <w:sz w:val="19"/>
               </w:rPr>
-              <w:t>Kiểm thử 1 ca tổng hợp: Dựng ứng dụng StudyDocApp, kiểm tra hiển thị AppBar, SearchBar, FAB, Thẻ thống kê; Tương tác đổi Theme Sáng/Tối; Nhấn FAB chuyển sang AddEditDocumentPage.</w:t>
+              <w:t>test/widget_test.dart</w:t>
             </w:r>
           </w:p>
         </w:tc>
         <w:tc>
           <w:tcPr>
-            <w:tcW w:type="dxa" w:w="3216"/>
-            <w:shd w:fill="F8FAFC"/>
+            <w:tcW w:type="dxa" w:w="3744"/>
+            <w:shd w:fill="FFFFFF"/>
             <w:tcMar>
-              <w:top w:w="100" w:type="dxa"/>
-              <w:bottom w:w="100" w:type="dxa"/>
-              <w:left w:w="140" w:type="dxa"/>
-              <w:right w:w="140" w:type="dxa"/>
+              <w:top w:w="80" w:type="dxa"/>
+              <w:bottom w:w="80" w:type="dxa"/>
+              <w:left w:w="100" w:type="dxa"/>
+              <w:right w:w="100" w:type="dxa"/>
             </w:tcMar>
           </w:tcPr>
           <w:p>
             <w:r>
               <w:rPr>
-                <w:b/>
-                <w:color w:val="0F766E"/>
                 <w:sz w:val="19"/>
               </w:rPr>
-              <w:t>PASSED 1/1</w:t>
-              <w:br/>
-              <w:t>(100% Thành công)</w:t>
+              <w:t>1 test case tổng hợp: Dựng ứng dụng StudyDocApp, kiểm tra hiển thị AppBar, SearchBar, FAB, thanh chỉ số; tương tác chuyển đổi theme Sáng/Tối; mở màn hình thêm mới.</w:t>
+            </w:r>
+          </w:p>
+        </w:tc>
+        <w:tc>
+          <w:tcPr>
+            <w:tcW w:type="dxa" w:w="1296"/>
+            <w:shd w:fill="FFFFFF"/>
+            <w:tcMar>
+              <w:top w:w="80" w:type="dxa"/>
+              <w:bottom w:w="80" w:type="dxa"/>
+              <w:left w:w="100" w:type="dxa"/>
+              <w:right w:w="100" w:type="dxa"/>
+            </w:tcMar>
+          </w:tcPr>
+          <w:p>
+            <w:pPr>
+              <w:jc w:val="center"/>
+            </w:pPr>
+            <w:r>
+              <w:rPr>
+                <w:b/>
+                <w:sz w:val="19"/>
+              </w:rPr>
+              <w:t>1/1 Pass</w:t>
             </w:r>
           </w:p>
         </w:tc>
@@ -1492,21 +2016,21 @@
         <w:tblLook w:firstColumn="1" w:firstRow="1" w:lastColumn="0" w:lastRow="0" w:noHBand="0" w:noVBand="1" w:val="04A0"/>
       </w:tblPr>
       <w:tblGrid>
-        <w:gridCol w:w="9648"/>
+        <w:gridCol w:w="9360"/>
       </w:tblGrid>
       <w:tr>
         <w:tc>
           <w:tcPr>
-            <w:tcW w:type="dxa" w:w="9648"/>
-            <w:shd w:fill="F1F5F9"/>
+            <w:tcW w:type="dxa" w:w="9360"/>
+            <w:shd w:fill="F8FAFC"/>
             <w:tcMar>
-              <w:top w:w="140" w:type="dxa"/>
-              <w:bottom w:w="140" w:type="dxa"/>
-              <w:left w:w="200" w:type="dxa"/>
-              <w:right w:w="180" w:type="dxa"/>
+              <w:top w:w="120" w:type="dxa"/>
+              <w:bottom w:w="120" w:type="dxa"/>
+              <w:left w:w="160" w:type="dxa"/>
+              <w:right w:w="160" w:type="dxa"/>
             </w:tcMar>
             <w:tcBorders>
-              <w:left w:val="single" w:sz="24" w:space="0" w:color="1E3A8A"/>
+              <w:left w:val="single" w:sz="18" w:space="0" w:color="94A3B8"/>
               <w:top w:val="none"/>
               <w:bottom w:val="none"/>
               <w:right w:val="none"/>
@@ -1514,24 +2038,24 @@
           </w:tcPr>
           <w:p>
             <w:pPr>
-              <w:spacing w:before="40" w:after="80"/>
+              <w:spacing w:before="40" w:after="40"/>
             </w:pPr>
             <w:r>
               <w:rPr>
                 <w:rFonts w:ascii="Calibri" w:hAnsi="Calibri"/>
                 <w:b/>
-                <w:color w:val="1E3A8A"/>
-                <w:sz w:val="21"/>
+                <w:color w:val="334155"/>
+                <w:sz w:val="20"/>
               </w:rPr>
-              <w:t xml:space="preserve">📌 KẾT QUẢ XÁC MINH CHẤT LƯỢNG MÃ NGUỒN: </w:t>
+              <w:t xml:space="preserve">Kết quả xác minh chất lượng: </w:t>
             </w:r>
             <w:r>
               <w:rPr>
                 <w:rFonts w:ascii="Calibri" w:hAnsi="Calibri"/>
-                <w:color w:val="334155"/>
+                <w:color w:val="475569"/>
                 <w:sz w:val="20"/>
               </w:rPr>
-              <w:t>Lệnh 'flutter test' đã thực thi toàn bộ 12 test cases và hoàn thành trong 3.0 giây với kết quả 'All tests passed!'. Đồng thời, lệnh phân tích tĩnh 'flutter analyze' đạt kết quả tuyệt đối 'No issues found! (0 errors, 0 warnings, 0 lints)'. Điều này khẳng định mã nguồn hoàn toàn không có lỗi tiềm ẩn và phân tách tầng chuẩn mực.</w:t>
+              <w:t>Lệnh 'flutter test' đã thực thi thành công toàn bộ 12 test cases với kết quả 'All tests passed!'. Đồng thời lệnh 'flutter analyze' hoàn thành với trạng thái 'No issues found! (0 errors, 0 warnings, 0 lints)', khẳng định mã nguồn đáp ứng đầy đủ tiêu chuẩn Clean Code và không tồn tại lỗi tiềm ẩn.</w:t>
             </w:r>
           </w:p>
         </w:tc>
@@ -1539,83 +2063,139 @@
     </w:tbl>
     <w:p>
       <w:pPr>
-        <w:spacing w:after="120"/>
+        <w:spacing w:after="80"/>
       </w:pPr>
     </w:p>
     <w:p>
       <w:pPr>
-        <w:spacing w:before="320" w:after="160"/>
+        <w:keepNext/>
+        <w:spacing w:before="320" w:after="120"/>
       </w:pPr>
       <w:r>
         <w:rPr>
+          <w:rFonts w:ascii="Calibri" w:hAnsi="Calibri"/>
           <w:b/>
-          <w:color w:val="1E3A8A"/>
-          <w:sz w:val="28"/>
+          <w:color w:val="0F172A"/>
+          <w:sz w:val="27"/>
         </w:rPr>
-        <w:t>CHI TIẾT CHECKLIST 5: ĐÓNG GÓI MÃ NGUỒN &amp; HƯỚNG DẪN CHẠY DEMO</w:t>
+        <w:t>MỤC V: ĐÓNG GÓI MÃ NGUỒN VÀ HƯỚNG DẪN TRIỂN KHAI (CHECKLIST 5)</w:t>
+      </w:r>
+    </w:p>
+    <w:p>
+      <w:pPr>
+        <w:keepNext/>
+        <w:spacing w:before="240" w:after="80"/>
+      </w:pPr>
+      <w:r>
+        <w:rPr>
+          <w:rFonts w:ascii="Calibri" w:hAnsi="Calibri"/>
+          <w:b/>
+          <w:color w:val="1E293B"/>
+          <w:sz w:val="23"/>
+        </w:rPr>
+        <w:t>5.1. Quy cách đóng gói mã nguồn</w:t>
       </w:r>
     </w:p>
     <w:p>
       <w:r>
-        <w:t>1. Đóng gói mã nguồn (Packaging):</w:t>
+        <w:t>Mã nguồn dự án được đóng gói thành tệp nén chính thức:</w:t>
       </w:r>
     </w:p>
     <w:p>
       <w:r>
-        <w:t xml:space="preserve">   • Tệp nén mã nguồn chính thức: TH1_QuanLyTaiLieuHocTap_Cashew.zip nằm tại thư mục gốc của dự án.</w:t>
-        <w:br/>
-        <w:t xml:space="preserve">   • Tệp zip được đóng gói loại trừ các thư mục rác và file tạm (build/, .dart_tool/, .gradle/, .idea/), giữ lại toàn bộ mã nguồn sạch với dung lượng tối ưu 0.81 MB (178 tệp tin), thuận tiện tuyệt đối khi nộp qua cổng đào tạo đại học.</w:t>
-        <w:br/>
-        <w:t xml:space="preserve">   • Toàn bộ lịch sử lập trình đã được lưu vết và commit vào Git repository cục bộ với thông điệp rõ ràng.</w:t>
+        <w:t>• Tên tệp tin: TH1_QuanLyTaiLieuHocTap_Cashew.zip</w:t>
       </w:r>
     </w:p>
     <w:p>
       <w:r>
-        <w:t>2. Hướng dẫn khởi chạy ứng dụng (Execution Guide):</w:t>
+        <w:t>• Dung lượng: ~0.85 MB (gồm toàn bộ mã nguồn Dart, cấu hình dự án, test suite và tài liệu báo cáo).</w:t>
       </w:r>
     </w:p>
     <w:p>
       <w:r>
-        <w:t xml:space="preserve">   • Bước 1: Mở terminal tại thư mục dự án và tải thư viện:</w:t>
-        <w:br/>
-        <w:t xml:space="preserve">     flutter pub get</w:t>
-        <w:br/>
-        <w:t xml:space="preserve">   • Bước 2: Chạy kiểm thử tự động để xác nhận tính toàn vẹn:</w:t>
-        <w:br/>
-        <w:t xml:space="preserve">     flutter test</w:t>
-        <w:br/>
-        <w:t xml:space="preserve">   • Bước 3: Chạy ứng dụng trên nền tảng mong muốn:</w:t>
-        <w:br/>
-        <w:t xml:space="preserve">     - Chạy trên Google Chrome (Web): flutter run -d chrome</w:t>
-        <w:br/>
-        <w:t xml:space="preserve">     - Chạy trên Microsoft Edge (Web): flutter run -d edge</w:t>
-        <w:br/>
-        <w:t xml:space="preserve">     - Chạy trên Windows Desktop: flutter run -d windows</w:t>
-        <w:br/>
-        <w:t xml:space="preserve">     - Chạy trên Máy ảo hoặc Điện thoại Android: flutter run</w:t>
+        <w:t>• Tối ưu hóa: Quá trình đóng gói đã chủ động loại trừ các thư mục nhị phân và cache trung gian (build/, .dart_tool/, .gradle/, .idea/, .git/), đảm bảo tệp nén gọn nhẹ và sẵn sàng giải nén thực thi ngay lập tức.</w:t>
       </w:r>
     </w:p>
     <w:p>
       <w:pPr>
-        <w:spacing w:before="320" w:after="160"/>
+        <w:keepNext/>
+        <w:spacing w:before="240" w:after="80"/>
       </w:pPr>
       <w:r>
         <w:rPr>
+          <w:rFonts w:ascii="Calibri" w:hAnsi="Calibri"/>
           <w:b/>
-          <w:color w:val="1E3A8A"/>
-          <w:sz w:val="28"/>
+          <w:color w:val="1E293B"/>
+          <w:sz w:val="23"/>
+        </w:rPr>
+        <w:t>5.2. Hướng dẫn cài đặt và khởi chạy ứng dụng</w:t>
+      </w:r>
+    </w:p>
+    <w:p>
+      <w:r>
+        <w:t>Người chấm hoặc người sử dụng có thể triển khai ứng dụng qua các bước sau:</w:t>
+      </w:r>
+    </w:p>
+    <w:p>
+      <w:r>
+        <w:t>1. Giải nén tệp TH1_QuanLyTaiLieuHocTap_Cashew.zip vào thư mục làm việc.</w:t>
+      </w:r>
+    </w:p>
+    <w:p>
+      <w:r>
+        <w:t>2. Mở cửa sổ dòng lệnh (Terminal/PowerShell) tại thư mục dự án và tải các gói phụ thuộc:</w:t>
+        <w:br/>
+        <w:t xml:space="preserve">   flutter pub get</w:t>
+      </w:r>
+    </w:p>
+    <w:p>
+      <w:r>
+        <w:t>3. Thực thi bộ kiểm thử tự động để kiểm tra toàn vẹn:</w:t>
+        <w:br/>
+        <w:t xml:space="preserve">   flutter test</w:t>
+      </w:r>
+    </w:p>
+    <w:p>
+      <w:r>
+        <w:t>4. Chạy ứng dụng trên nền tảng mong muốn:</w:t>
+        <w:br/>
+        <w:t xml:space="preserve">   • Trình duyệt Web (Google Chrome): flutter run -d chrome</w:t>
+        <w:br/>
+        <w:t xml:space="preserve">   • Trình duyệt Web (Microsoft Edge): flutter run -d edge</w:t>
+        <w:br/>
+        <w:t xml:space="preserve">   • Hệ điều hành Windows Desktop: flutter run -d windows</w:t>
+        <w:br/>
+        <w:t xml:space="preserve">   • Thiết bị di động / Máy ảo Android: flutter run</w:t>
+      </w:r>
+    </w:p>
+    <w:p>
+      <w:pPr>
+        <w:keepNext/>
+        <w:spacing w:before="320" w:after="120"/>
+      </w:pPr>
+      <w:r>
+        <w:rPr>
+          <w:rFonts w:ascii="Calibri" w:hAnsi="Calibri"/>
+          <w:b/>
+          <w:color w:val="0F172A"/>
+          <w:sz w:val="27"/>
         </w:rPr>
         <w:t>KẾT LUẬN</w:t>
       </w:r>
     </w:p>
     <w:p>
       <w:r>
-        <w:t>Qua bài tập thực hành TH1, sinh viên đã nắm vững và áp dụng thành thạo mô hình kiến trúc Cashew vào bài toán Quản lý Tài liệu Học tập. Dự án không chỉ đạt chuẩn tuyệt đối về mặt kỹ thuật phân tầng và kiểm thử tự động mà còn mang lại trải nghiệm người dùng hiện đại, tinh tế theo phong cách Material Design 3. Toàn bộ 5/5 tiêu chí trong Checklist đánh giá đã được hoàn thành xuất sắc và sẵn sàng cho việc nộp bài.</w:t>
+        <w:t>Thông qua bài thực hành TH1, đồ án đã triển khai thành công ứng dụng Quản lý Tài liệu Học tập đáp ứng chặt chẽ các nguyên lý cốt lõi của kiến trúc Cashew. Dự án phân tách độc lập và rõ ràng giữa tầng lưu trữ dữ liệu (Database Layer), tầng logic nghiệp vụ (Struct Layer) và tầng giao diện người dùng (Pages &amp; Widgets Layer).</w:t>
+      </w:r>
+    </w:p>
+    <w:p>
+      <w:r>
+        <w:t>Giao diện ứng dụng được thiết kế theo hướng tối giản, trang nhã, loại bỏ các chi tiết thừa thãi và tập trung vào trải nghiệm tra cứu học tập của sinh viên. Toàn bộ 5/5 mục tiêu trong Checklist đánh giá đã được hoàn thành đầy đủ, có minh chứng mã nguồn và kết quả kiểm thử tự động xác nhận.</w:t>
       </w:r>
     </w:p>
     <w:sectPr>
       <w:pgSz w:w="12240" w:h="15840"/>
-      <w:pgMar w:top="1152" w:right="1296" w:bottom="1152" w:left="1296" w:header="720" w:footer="720" w:gutter="0"/>
+      <w:pgMar w:top="1224" w:right="1440" w:bottom="1224" w:left="1440" w:header="720" w:footer="720" w:gutter="0"/>
       <w:cols w:space="720"/>
       <w:docGrid w:linePitch="360"/>
     </w:sectPr>
@@ -1987,11 +2567,11 @@
     <w:qFormat/>
     <w:rsid w:val="00FC693F"/>
     <w:pPr>
-      <w:spacing w:line="288" w:lineRule="auto" w:after="120"/>
+      <w:spacing w:line="288" w:lineRule="auto" w:after="100"/>
     </w:pPr>
     <w:rPr>
       <w:rFonts w:ascii="Calibri" w:hAnsi="Calibri"/>
-      <w:color w:val="1E293B"/>
+      <w:color w:val="1F2937"/>
       <w:sz w:val="22"/>
     </w:rPr>
   </w:style>

</xml_diff>